<commit_message>
Deploying to gh-pages from @ Morrison-Lab/pds@5305f41ab269fc1da36f4628a57578383e2c6286 🚀
</commit_message>
<xml_diff>
--- a/independence.docx
+++ b/independence.docx
@@ -15,7 +15,7 @@
         <w:pStyle w:val="Date"/>
       </w:pPr>
       <w:r>
-        <w:t xml:space="preserve">Last modified: 2026-09-28 14:24:58 (PDT)</w:t>
+        <w:t xml:space="preserve">Last modified: 2026-09-28 15:15:49 (PDT)</w:t>
       </w:r>
     </w:p>
     <w:p>
@@ -9301,6 +9301,265 @@
       </w:r>
     </w:p>
     <w:bookmarkEnd w:id="28"/>
+    <w:tbl>
+      <w:tblPr>
+        <w:tblStyle w:val="Table"/>
+        <w:tblLook w:firstRow="0" w:lastRow="0" w:firstColumn="0" w:lastColumn="0" w:noHBand="0" w:noVBand="0" w:val="0000"/>
+        <w:tblBorders>
+          <w:top w:val="single" w:sz="4" w:space="0" w:color="00A047"/>
+          <w:left w:val="single" w:sz="24" w:space="0" w:color="00A047"/>
+          <w:bottom w:val="single" w:sz="4" w:space="0" w:color="00A047"/>
+          <w:right w:val="single" w:sz="4" w:space="0" w:color="00A047"/>
+        </w:tblBorders>
+        <w:tblCellMar>
+          <w:left w:w="144" w:type="dxa"/>
+          <w:right w:w="144" w:type="dxa"/>
+        </w:tblCellMar>
+        <w:tblLook w:firstRow="0" w:lastRow="0" w:firstColumn="0" w:lastColumn="0" w:noHBand="0" w:noVBand="0" w:val="0000"/>
+      </w:tblPr>
+      <w:tr>
+        <w:trPr>
+          <w:cantSplit/>
+        </w:trPr>
+        <w:tc>
+          <w:tcPr>
+            <w:shd w:color="auto" w:fill="ccf1e3" w:val="clear"/>
+            <w:tcMar>
+              <w:top w:w="92" w:type="dxa"/>
+              <w:bottom w:w="92" w:type="dxa"/>
+            </w:tcMar>
+          </w:tcPr>
+          <w:p>
+            <w:pPr>
+              <w:pStyle w:val="BodyText"/>
+            </w:pPr>
+            <w:pPr>
+              <w:spacing w:before="0" w:after="0"/>
+              <w:textAlignment w:val="center"/>
+            </w:pPr>
+            <w:r>
+              <w:drawing>
+                <wp:inline>
+                  <wp:extent cx="152400" cy="152400"/>
+                  <wp:effectExtent b="0" l="0" r="0" t="0"/>
+                  <wp:docPr descr="" title="" id="30" name="Picture"/>
+                  <a:graphic>
+                    <a:graphicData uri="http://schemas.openxmlformats.org/drawingml/2006/picture">
+                      <pic:pic>
+                        <pic:nvPicPr>
+                          <pic:cNvPr descr="/opt/quarto/share/formats/docx/tip.png" id="31" name="Picture"/>
+                          <pic:cNvPicPr>
+                            <a:picLocks noChangeArrowheads="1" noChangeAspect="1"/>
+                          </pic:cNvPicPr>
+                        </pic:nvPicPr>
+                        <pic:blipFill>
+                          <a:blip r:embed="rId29"/>
+                          <a:stretch>
+                            <a:fillRect/>
+                          </a:stretch>
+                        </pic:blipFill>
+                        <pic:spPr bwMode="auto">
+                          <a:xfrm>
+                            <a:off x="0" y="0"/>
+                            <a:ext cx="152400" cy="152400"/>
+                          </a:xfrm>
+                          <a:prstGeom prst="rect">
+                            <a:avLst/>
+                          </a:prstGeom>
+                          <a:noFill/>
+                          <a:ln w="9525">
+                            <a:noFill/>
+                            <a:headEnd/>
+                            <a:tailEnd/>
+                          </a:ln>
+                        </pic:spPr>
+                      </pic:pic>
+                    </a:graphicData>
+                  </a:graphic>
+                </wp:inline>
+              </w:drawing>
+            </w:r>
+            <w:r>
+              <w:t xml:space="preserve"> </w:t>
+            </w:r>
+            <w:r>
+              <w:t xml:space="preserve"> </w:t>
+            </w:r>
+            <w:r>
+              <w:t xml:space="preserve">Video lecture</w:t>
+            </w:r>
+          </w:p>
+        </w:tc>
+      </w:tr>
+      <w:tr>
+        <w:trPr>
+          <w:cantSplit/>
+        </w:trPr>
+        <w:tc>
+          <w:tcPr>
+            <w:tcMar>
+              <w:top w:w="108" w:type="dxa"/>
+              <w:bottom w:w="108" w:type="dxa"/>
+            </w:tcMar>
+          </w:tcPr>
+          <w:p>
+            <w:pPr>
+              <w:pStyle w:val="BodyText"/>
+            </w:pPr>
+            <w:pPr>
+              <w:spacing w:before="16" w:after="16"/>
+            </w:pPr>
+            <w:r>
+              <w:t xml:space="preserve">Hutchinson’s</w:t>
+            </w:r>
+            <w:r>
+              <w:t xml:space="preserve"> </w:t>
+            </w:r>
+            <w:hyperlink r:id="rId32">
+              <w:r>
+                <w:rPr>
+                  <w:rStyle w:val="Hyperlink"/>
+                </w:rPr>
+                <w:t xml:space="preserve">Probability Refresher</w:t>
+              </w:r>
+            </w:hyperlink>
+            <w:r>
+              <w:t xml:space="preserve"> </w:t>
+            </w:r>
+            <w:r>
+              <w:t xml:space="preserve">(27 min)</w:t>
+            </w:r>
+            <w:r>
+              <w:t xml:space="preserve"> </w:t>
+            </w:r>
+            <w:r>
+              <w:t xml:space="preserve">covers independence</w:t>
+            </w:r>
+            <w:r>
+              <w:t xml:space="preserve"> </w:t>
+            </w:r>
+            <w:r>
+              <w:t xml:space="preserve">(Hutchinson, n.d.)</w:t>
+            </w:r>
+            <w:r>
+              <w:t xml:space="preserve">.</w:t>
+            </w:r>
+            <w:r>
+              <w:t xml:space="preserve"> </w:t>
+            </w:r>
+            <w:r>
+              <w:t xml:space="preserve">The login for the video site is posted</w:t>
+            </w:r>
+            <w:r>
+              <w:t xml:space="preserve"> </w:t>
+            </w:r>
+            <w:hyperlink r:id="rId33">
+              <w:r>
+                <w:rPr>
+                  <w:rStyle w:val="Hyperlink"/>
+                </w:rPr>
+                <w:t xml:space="preserve">on Canvas</w:t>
+              </w:r>
+            </w:hyperlink>
+            <w:r>
+              <w:t xml:space="preserve">.</w:t>
+            </w:r>
+          </w:p>
+          <w:p/>
+        </w:tc>
+      </w:tr>
+    </w:tbl>
+    <w:bookmarkStart w:id="37" w:name="references"/>
+    <w:p>
+      <w:pPr>
+        <w:pStyle w:val="Heading2"/>
+      </w:pPr>
+      <w:r>
+        <w:t xml:space="preserve">References</w:t>
+      </w:r>
+    </w:p>
+    <w:bookmarkStart w:id="36" w:name="refs"/>
+    <w:bookmarkStart w:id="35" w:name="ref-hutchinson_wwu_ml_videos"/>
+    <w:p>
+      <w:pPr>
+        <w:pStyle w:val="Bibliography"/>
+      </w:pPr>
+      <w:r>
+        <w:t xml:space="preserve">Hutchinson, Brian. n.d.</w:t>
+      </w:r>
+      <w:r>
+        <w:t xml:space="preserve"> </w:t>
+      </w:r>
+      <w:r>
+        <w:rPr>
+          <w:i/>
+          <w:iCs/>
+        </w:rPr>
+        <w:t xml:space="preserve">DATA</w:t>
+      </w:r>
+      <w:r>
+        <w:rPr>
+          <w:i/>
+          <w:iCs/>
+        </w:rPr>
+        <w:t xml:space="preserve"> </w:t>
+      </w:r>
+      <w:r>
+        <w:rPr>
+          <w:i/>
+          <w:iCs/>
+        </w:rPr>
+        <w:t xml:space="preserve">471/571 (Machine Learning) and</w:t>
+      </w:r>
+      <w:r>
+        <w:rPr>
+          <w:i/>
+          <w:iCs/>
+        </w:rPr>
+        <w:t xml:space="preserve"> </w:t>
+      </w:r>
+      <w:r>
+        <w:rPr>
+          <w:i/>
+          <w:iCs/>
+        </w:rPr>
+        <w:t xml:space="preserve">CSCI</w:t>
+      </w:r>
+      <w:r>
+        <w:rPr>
+          <w:i/>
+          <w:iCs/>
+        </w:rPr>
+        <w:t xml:space="preserve"> </w:t>
+      </w:r>
+      <w:r>
+        <w:rPr>
+          <w:i/>
+          <w:iCs/>
+        </w:rPr>
+        <w:t xml:space="preserve">481/581 (Deep Learning) Video Lectures</w:t>
+      </w:r>
+      <w:r>
+        <w:t xml:space="preserve">. Western Washington University. Accessed September 28, 2026.</w:t>
+      </w:r>
+      <w:r>
+        <w:t xml:space="preserve"> </w:t>
+      </w:r>
+      <w:hyperlink r:id="rId34">
+        <w:r>
+          <w:rPr>
+            <w:rStyle w:val="Hyperlink"/>
+          </w:rPr>
+          <w:t xml:space="preserve">https://facultyweb.cs.wwu.edu/~hutchib2/video_lectures/data371/</w:t>
+        </w:r>
+      </w:hyperlink>
+      <w:r>
+        <w:t xml:space="preserve">.</w:t>
+      </w:r>
+    </w:p>
+    <w:bookmarkEnd w:id="35"/>
+    <w:bookmarkEnd w:id="36"/>
+    <w:bookmarkEnd w:id="37"/>
     <w:sectPr>
       <w:footnotePr>
         <w:numRestart w:val="eachSect"/>

</xml_diff>

<commit_message>
Deploying to gh-pages from @ Morrison-Lab/pds@d822ff644fa03628c3eb9563d1c1e78d19e33b0d 🚀
</commit_message>
<xml_diff>
--- a/independence.docx
+++ b/independence.docx
@@ -15,7 +15,7 @@
         <w:pStyle w:val="Date"/>
       </w:pPr>
       <w:r>
-        <w:t xml:space="preserve">Last modified: 2026-10-12 20:22:04 (PDT)</w:t>
+        <w:t xml:space="preserve">Last modified: 2026-10-12 20:27:50 (PDT)</w:t>
       </w:r>
     </w:p>
     <w:p>
@@ -18595,7 +18595,47 @@
         </w:tc>
       </w:tr>
     </w:tbl>
-    <w:bookmarkStart w:id="54" w:name="references"/>
+    <w:p>
+      <w:pPr>
+        <w:pStyle w:val="BodyText"/>
+      </w:pPr>
+      <w:r>
+        <w:t xml:space="preserve">5MinuteAI explains</w:t>
+      </w:r>
+      <w:r>
+        <w:t xml:space="preserve"> </w:t>
+      </w:r>
+      <w:hyperlink r:id="rId47">
+        <w:r>
+          <w:rPr>
+            <w:rStyle w:val="Hyperlink"/>
+          </w:rPr>
+          <w:t xml:space="preserve">independence</w:t>
+        </w:r>
+      </w:hyperlink>
+      <w:r>
+        <w:t xml:space="preserve"> </w:t>
+      </w:r>
+      <w:r>
+        <w:t xml:space="preserve">in five minutes,</w:t>
+      </w:r>
+      <w:r>
+        <w:t xml:space="preserve"> </w:t>
+      </w:r>
+      <w:r>
+        <w:t xml:space="preserve">following the University of Washington’s CSE 312</w:t>
+      </w:r>
+      <w:r>
+        <w:t xml:space="preserve"> </w:t>
+      </w:r>
+      <w:r>
+        <w:t xml:space="preserve">(5MinuteAI, n.d.)</w:t>
+      </w:r>
+      <w:r>
+        <w:t xml:space="preserve">.</w:t>
+      </w:r>
+    </w:p>
+    <w:bookmarkStart w:id="57" w:name="references"/>
     <w:p>
       <w:pPr>
         <w:pStyle w:val="Heading2"/>
@@ -18604,8 +18644,45 @@
         <w:t xml:space="preserve">References</w:t>
       </w:r>
     </w:p>
-    <w:bookmarkStart w:id="53" w:name="refs"/>
-    <w:bookmarkStart w:id="47" w:name="ref-billingsley1995probability"/>
+    <w:bookmarkStart w:id="56" w:name="refs"/>
+    <w:bookmarkStart w:id="49" w:name="ref-fiveminuteai_probstat"/>
+    <w:p>
+      <w:pPr>
+        <w:pStyle w:val="Bibliography"/>
+      </w:pPr>
+      <w:r>
+        <w:t xml:space="preserve">5MinuteAI. n.d.</w:t>
+      </w:r>
+      <w:r>
+        <w:t xml:space="preserve"> </w:t>
+      </w:r>
+      <w:r>
+        <w:rPr>
+          <w:i/>
+          <w:iCs/>
+        </w:rPr>
+        <w:t xml:space="preserve">Probability &amp; Statistics</w:t>
+      </w:r>
+      <w:r>
+        <w:t xml:space="preserve">. Video playlist on YouTube. Accessed October 12, 2026.</w:t>
+      </w:r>
+      <w:r>
+        <w:t xml:space="preserve"> </w:t>
+      </w:r>
+      <w:hyperlink r:id="rId48">
+        <w:r>
+          <w:rPr>
+            <w:rStyle w:val="Hyperlink"/>
+          </w:rPr>
+          <w:t xml:space="preserve">https://www.youtube.com/playlist?list=PLeB45KifGiuHesi4PALNZSYZFhViVGQJK</w:t>
+        </w:r>
+      </w:hyperlink>
+      <w:r>
+        <w:t xml:space="preserve">.</w:t>
+      </w:r>
+    </w:p>
+    <w:bookmarkEnd w:id="49"/>
+    <w:bookmarkStart w:id="50" w:name="ref-billingsley1995probability"/>
     <w:p>
       <w:pPr>
         <w:pStyle w:val="Bibliography"/>
@@ -18627,8 +18704,8 @@
         <w:t xml:space="preserve">. 3rd ed. Wiley Series in Probability and Mathematical Statistics. Wiley.</w:t>
       </w:r>
     </w:p>
-    <w:bookmarkEnd w:id="47"/>
-    <w:bookmarkStart w:id="49" w:name="ref-CaseBerg01"/>
+    <w:bookmarkEnd w:id="50"/>
+    <w:bookmarkStart w:id="52" w:name="ref-CaseBerg01"/>
     <w:p>
       <w:pPr>
         <w:pStyle w:val="Bibliography"/>
@@ -18652,7 +18729,7 @@
       <w:r>
         <w:t xml:space="preserve"> </w:t>
       </w:r>
-      <w:hyperlink r:id="rId48">
+      <w:hyperlink r:id="rId51">
         <w:r>
           <w:rPr>
             <w:rStyle w:val="Hyperlink"/>
@@ -18664,8 +18741,8 @@
         <w:t xml:space="preserve">.</w:t>
       </w:r>
     </w:p>
-    <w:bookmarkEnd w:id="49"/>
-    <w:bookmarkStart w:id="50" w:name="ref-hutchinson2024data471"/>
+    <w:bookmarkEnd w:id="52"/>
+    <w:bookmarkStart w:id="53" w:name="ref-hutchinson2024data471"/>
     <w:p>
       <w:pPr>
         <w:pStyle w:val="Bibliography"/>
@@ -18701,8 +18778,8 @@
         <w:t xml:space="preserve">. Western Washington University.</w:t>
       </w:r>
     </w:p>
-    <w:bookmarkEnd w:id="50"/>
-    <w:bookmarkStart w:id="52" w:name="ref-hutchinson_wwu_ml_videos"/>
+    <w:bookmarkEnd w:id="53"/>
+    <w:bookmarkStart w:id="55" w:name="ref-hutchinson_wwu_ml_videos"/>
     <w:p>
       <w:pPr>
         <w:pStyle w:val="Bibliography"/>
@@ -18768,7 +18845,7 @@
       <w:r>
         <w:t xml:space="preserve"> </w:t>
       </w:r>
-      <w:hyperlink r:id="rId51">
+      <w:hyperlink r:id="rId54">
         <w:r>
           <w:rPr>
             <w:rStyle w:val="Hyperlink"/>
@@ -18780,9 +18857,9 @@
         <w:t xml:space="preserve">.</w:t>
       </w:r>
     </w:p>
-    <w:bookmarkEnd w:id="52"/>
-    <w:bookmarkEnd w:id="53"/>
-    <w:bookmarkEnd w:id="54"/>
+    <w:bookmarkEnd w:id="55"/>
+    <w:bookmarkEnd w:id="56"/>
+    <w:bookmarkEnd w:id="57"/>
     <w:sectPr>
       <w:footnotePr>
         <w:numRestart w:val="eachSect"/>

</xml_diff>

<commit_message>
Deploying to gh-pages from @ Morrison-Lab/pds@1359a2d95f481f6127861727e385b4ca2f623ef2 🚀
</commit_message>
<xml_diff>
--- a/independence.docx
+++ b/independence.docx
@@ -15,7 +15,7 @@
         <w:pStyle w:val="Date"/>
       </w:pPr>
       <w:r>
-        <w:t xml:space="preserve">Last modified: 2026-10-17 13:43:25 (PDT)</w:t>
+        <w:t xml:space="preserve">Last modified: 2026-10-17 13:49:30 (PDT)</w:t>
       </w:r>
     </w:p>
     <w:p>
@@ -105,6 +105,12 @@
           <w:bCs/>
         </w:rPr>
         <w:t xml:space="preserve">statistically independent</w:t>
+      </w:r>
+      <w:r>
+        <w:t xml:space="preserve"> </w:t>
+      </w:r>
+      <w:r>
+        <w:t xml:space="preserve">(Wikipedia contributors 2026b)</w:t>
       </w:r>
       <w:r>
         <w:t xml:space="preserve"> </w:t>
@@ -5399,6 +5405,12 @@
           <w:bCs/>
         </w:rPr>
         <w:t xml:space="preserve">conditionally independent</w:t>
+      </w:r>
+      <w:r>
+        <w:t xml:space="preserve"> </w:t>
+      </w:r>
+      <w:r>
+        <w:t xml:space="preserve">(Wikipedia contributors 2026a)</w:t>
       </w:r>
       <w:r>
         <w:t xml:space="preserve"> </w:t>
@@ -17410,7 +17422,19 @@
         <w:t xml:space="preserve">”</w:t>
       </w:r>
       <w:r>
-        <w:t xml:space="preserve">) if they are:</w:t>
+        <w:t xml:space="preserve">)</w:t>
+      </w:r>
+      <w:r>
+        <w:t xml:space="preserve"> </w:t>
+      </w:r>
+      <w:r>
+        <w:t xml:space="preserve">(Wikipedia contributors 2026c)</w:t>
+      </w:r>
+      <w:r>
+        <w:t xml:space="preserve"> </w:t>
+      </w:r>
+      <w:r>
+        <w:t xml:space="preserve">if they are:</w:t>
       </w:r>
     </w:p>
     <w:p>
@@ -18870,17 +18894,78 @@
         <w:t xml:space="preserve">.</w:t>
       </w:r>
     </w:p>
-    <w:bookmarkStart w:id="57" w:name="references"/>
+    <w:bookmarkStart w:id="48" w:name="further-reading"/>
     <w:p>
       <w:pPr>
         <w:pStyle w:val="Heading2"/>
       </w:pPr>
       <w:r>
+        <w:t xml:space="preserve">Further reading</w:t>
+      </w:r>
+    </w:p>
+    <w:p>
+      <w:pPr>
+        <w:numPr>
+          <w:ilvl w:val="0"/>
+          <w:numId w:val="1004"/>
+        </w:numPr>
+      </w:pPr>
+      <w:r>
+        <w:t xml:space="preserve">Wikipedia contributors (2026b)</w:t>
+      </w:r>
+      <w:r>
+        <w:t xml:space="preserve"> </w:t>
+      </w:r>
+      <w:r>
+        <w:t xml:space="preserve">— independent events and random variables</w:t>
+      </w:r>
+    </w:p>
+    <w:p>
+      <w:pPr>
+        <w:numPr>
+          <w:ilvl w:val="0"/>
+          <w:numId w:val="1004"/>
+        </w:numPr>
+      </w:pPr>
+      <w:r>
+        <w:t xml:space="preserve">Wikipedia contributors (2026a)</w:t>
+      </w:r>
+      <w:r>
+        <w:t xml:space="preserve"> </w:t>
+      </w:r>
+      <w:r>
+        <w:t xml:space="preserve">— conditional independence, with examples</w:t>
+      </w:r>
+    </w:p>
+    <w:p>
+      <w:pPr>
+        <w:numPr>
+          <w:ilvl w:val="0"/>
+          <w:numId w:val="1004"/>
+        </w:numPr>
+      </w:pPr>
+      <w:r>
+        <w:t xml:space="preserve">Wikipedia contributors (2026c)</w:t>
+      </w:r>
+      <w:r>
+        <w:t xml:space="preserve"> </w:t>
+      </w:r>
+      <w:r>
+        <w:t xml:space="preserve">— independent and identically distributed random variables</w:t>
+      </w:r>
+    </w:p>
+    <w:bookmarkEnd w:id="48"/>
+    <w:bookmarkStart w:id="64" w:name="references"/>
+    <w:p>
+      <w:pPr>
+        <w:pStyle w:val="Heading2"/>
+      </w:pPr>
+      <w:r>
         <w:t xml:space="preserve">References</w:t>
       </w:r>
     </w:p>
-    <w:bookmarkStart w:id="56" w:name="refs"/>
-    <w:bookmarkStart w:id="49" w:name="ref-fiveminuteai_probstat"/>
+    <w:bookmarkStart w:id="63" w:name="refs"/>
+    <w:bookmarkStart w:id="50" w:name="ref-fiveminuteai_probstat"/>
     <w:p>
       <w:pPr>
         <w:pStyle w:val="Bibliography"/>
@@ -18904,7 +18989,7 @@
       <w:r>
         <w:t xml:space="preserve"> </w:t>
       </w:r>
-      <w:hyperlink r:id="rId48">
+      <w:hyperlink r:id="rId49">
         <w:r>
           <w:rPr>
             <w:rStyle w:val="Hyperlink"/>
@@ -18916,8 +19001,8 @@
         <w:t xml:space="preserve">.</w:t>
       </w:r>
     </w:p>
-    <w:bookmarkEnd w:id="49"/>
-    <w:bookmarkStart w:id="50" w:name="ref-billingsley1995probability"/>
+    <w:bookmarkEnd w:id="50"/>
+    <w:bookmarkStart w:id="51" w:name="ref-billingsley1995probability"/>
     <w:p>
       <w:pPr>
         <w:pStyle w:val="Bibliography"/>
@@ -18939,8 +19024,8 @@
         <w:t xml:space="preserve">. 3rd ed. Wiley Series in Probability and Mathematical Statistics. Wiley.</w:t>
       </w:r>
     </w:p>
-    <w:bookmarkEnd w:id="50"/>
-    <w:bookmarkStart w:id="52" w:name="ref-CaseBerg01"/>
+    <w:bookmarkEnd w:id="51"/>
+    <w:bookmarkStart w:id="53" w:name="ref-CaseBerg01"/>
     <w:p>
       <w:pPr>
         <w:pStyle w:val="Bibliography"/>
@@ -18964,7 +19049,7 @@
       <w:r>
         <w:t xml:space="preserve"> </w:t>
       </w:r>
-      <w:hyperlink r:id="rId51">
+      <w:hyperlink r:id="rId52">
         <w:r>
           <w:rPr>
             <w:rStyle w:val="Hyperlink"/>
@@ -18976,8 +19061,8 @@
         <w:t xml:space="preserve">.</w:t>
       </w:r>
     </w:p>
-    <w:bookmarkEnd w:id="52"/>
-    <w:bookmarkStart w:id="53" w:name="ref-hutchinson2024data471"/>
+    <w:bookmarkEnd w:id="53"/>
+    <w:bookmarkStart w:id="54" w:name="ref-hutchinson2024data471"/>
     <w:p>
       <w:pPr>
         <w:pStyle w:val="Bibliography"/>
@@ -19013,8 +19098,8 @@
         <w:t xml:space="preserve">. Western Washington University.</w:t>
       </w:r>
     </w:p>
-    <w:bookmarkEnd w:id="53"/>
-    <w:bookmarkStart w:id="55" w:name="ref-hutchinson_wwu_ml_videos"/>
+    <w:bookmarkEnd w:id="54"/>
+    <w:bookmarkStart w:id="56" w:name="ref-hutchinson_wwu_ml_videos"/>
     <w:p>
       <w:pPr>
         <w:pStyle w:val="Bibliography"/>
@@ -19080,7 +19165,7 @@
       <w:r>
         <w:t xml:space="preserve"> </w:t>
       </w:r>
-      <w:hyperlink r:id="rId54">
+      <w:hyperlink r:id="rId55">
         <w:r>
           <w:rPr>
             <w:rStyle w:val="Hyperlink"/>
@@ -19092,9 +19177,225 @@
         <w:t xml:space="preserve">.</w:t>
       </w:r>
     </w:p>
-    <w:bookmarkEnd w:id="55"/>
     <w:bookmarkEnd w:id="56"/>
-    <w:bookmarkEnd w:id="57"/>
+    <w:bookmarkStart w:id="58" w:name="ref-wikipedia_conditional_independence"/>
+    <w:p>
+      <w:pPr>
+        <w:pStyle w:val="Bibliography"/>
+      </w:pPr>
+      <w:r>
+        <w:t xml:space="preserve">Wikipedia contributors. 2026a.</w:t>
+      </w:r>
+      <w:r>
+        <w:t xml:space="preserve"> </w:t>
+      </w:r>
+      <w:r>
+        <w:rPr>
+          <w:i/>
+          <w:iCs/>
+        </w:rPr>
+        <w:t xml:space="preserve">Conditional Independence —</w:t>
+      </w:r>
+      <w:r>
+        <w:rPr>
+          <w:i/>
+          <w:iCs/>
+        </w:rPr>
+        <w:t xml:space="preserve"> </w:t>
+      </w:r>
+      <w:r>
+        <w:rPr>
+          <w:i/>
+          <w:iCs/>
+        </w:rPr>
+        <w:t xml:space="preserve">Wikipedia</w:t>
+      </w:r>
+      <w:r>
+        <w:rPr>
+          <w:i/>
+          <w:iCs/>
+        </w:rPr>
+        <w:t xml:space="preserve">,</w:t>
+      </w:r>
+      <w:r>
+        <w:rPr>
+          <w:i/>
+          <w:iCs/>
+        </w:rPr>
+        <w:t xml:space="preserve"> </w:t>
+      </w:r>
+      <w:r>
+        <w:rPr>
+          <w:i/>
+          <w:iCs/>
+        </w:rPr>
+        <w:t xml:space="preserve">the Free Encyclopedia</w:t>
+      </w:r>
+      <w:r>
+        <w:t xml:space="preserve">.</w:t>
+      </w:r>
+      <w:r>
+        <w:t xml:space="preserve"> </w:t>
+      </w:r>
+      <w:hyperlink r:id="rId57">
+        <w:r>
+          <w:rPr>
+            <w:rStyle w:val="Hyperlink"/>
+          </w:rPr>
+          <w:t xml:space="preserve">https://en.wikipedia.org/wiki/Conditional_independence</w:t>
+        </w:r>
+      </w:hyperlink>
+      <w:r>
+        <w:t xml:space="preserve">.</w:t>
+      </w:r>
+    </w:p>
+    <w:bookmarkEnd w:id="58"/>
+    <w:bookmarkStart w:id="60" w:name="X838d9f9be48db99711c4c0760e5c8566b98b66b"/>
+    <w:p>
+      <w:pPr>
+        <w:pStyle w:val="Bibliography"/>
+      </w:pPr>
+      <w:r>
+        <w:t xml:space="preserve">Wikipedia contributors. 2026b.</w:t>
+      </w:r>
+      <w:r>
+        <w:t xml:space="preserve"> </w:t>
+      </w:r>
+      <w:r>
+        <w:rPr>
+          <w:i/>
+          <w:iCs/>
+        </w:rPr>
+        <w:t xml:space="preserve">Independence (Probability Theory) —</w:t>
+      </w:r>
+      <w:r>
+        <w:rPr>
+          <w:i/>
+          <w:iCs/>
+        </w:rPr>
+        <w:t xml:space="preserve"> </w:t>
+      </w:r>
+      <w:r>
+        <w:rPr>
+          <w:i/>
+          <w:iCs/>
+        </w:rPr>
+        <w:t xml:space="preserve">Wikipedia</w:t>
+      </w:r>
+      <w:r>
+        <w:rPr>
+          <w:i/>
+          <w:iCs/>
+        </w:rPr>
+        <w:t xml:space="preserve">,</w:t>
+      </w:r>
+      <w:r>
+        <w:rPr>
+          <w:i/>
+          <w:iCs/>
+        </w:rPr>
+        <w:t xml:space="preserve"> </w:t>
+      </w:r>
+      <w:r>
+        <w:rPr>
+          <w:i/>
+          <w:iCs/>
+        </w:rPr>
+        <w:t xml:space="preserve">the Free Encyclopedia</w:t>
+      </w:r>
+      <w:r>
+        <w:t xml:space="preserve">.</w:t>
+      </w:r>
+      <w:r>
+        <w:t xml:space="preserve"> </w:t>
+      </w:r>
+      <w:hyperlink r:id="rId59">
+        <w:r>
+          <w:rPr>
+            <w:rStyle w:val="Hyperlink"/>
+          </w:rPr>
+          <w:t xml:space="preserve">https://en.wikipedia.org/wiki/Independence_(probability_theory)</w:t>
+        </w:r>
+      </w:hyperlink>
+      <w:r>
+        <w:t xml:space="preserve">.</w:t>
+      </w:r>
+    </w:p>
+    <w:bookmarkEnd w:id="60"/>
+    <w:bookmarkStart w:id="62" w:name="ref-wikipedia_iid"/>
+    <w:p>
+      <w:pPr>
+        <w:pStyle w:val="Bibliography"/>
+      </w:pPr>
+      <w:r>
+        <w:t xml:space="preserve">Wikipedia contributors. 2026c.</w:t>
+      </w:r>
+      <w:r>
+        <w:t xml:space="preserve"> </w:t>
+      </w:r>
+      <w:r>
+        <w:rPr>
+          <w:i/>
+          <w:iCs/>
+        </w:rPr>
+        <w:t xml:space="preserve">Independent and Identically Distributed Random Variables —</w:t>
+      </w:r>
+      <w:r>
+        <w:rPr>
+          <w:i/>
+          <w:iCs/>
+        </w:rPr>
+        <w:t xml:space="preserve"> </w:t>
+      </w:r>
+      <w:r>
+        <w:rPr>
+          <w:i/>
+          <w:iCs/>
+        </w:rPr>
+        <w:t xml:space="preserve">Wikipedia</w:t>
+      </w:r>
+      <w:r>
+        <w:rPr>
+          <w:i/>
+          <w:iCs/>
+        </w:rPr>
+        <w:t xml:space="preserve">,</w:t>
+      </w:r>
+      <w:r>
+        <w:rPr>
+          <w:i/>
+          <w:iCs/>
+        </w:rPr>
+        <w:t xml:space="preserve"> </w:t>
+      </w:r>
+      <w:r>
+        <w:rPr>
+          <w:i/>
+          <w:iCs/>
+        </w:rPr>
+        <w:t xml:space="preserve">the Free Encyclopedia</w:t>
+      </w:r>
+      <w:r>
+        <w:t xml:space="preserve">.</w:t>
+      </w:r>
+      <w:r>
+        <w:t xml:space="preserve"> </w:t>
+      </w:r>
+      <w:hyperlink r:id="rId61">
+        <w:r>
+          <w:rPr>
+            <w:rStyle w:val="Hyperlink"/>
+          </w:rPr>
+          <w:t xml:space="preserve">https://en.wikipedia.org/wiki/Independent_and_identically_distributed_random_variables</w:t>
+        </w:r>
+      </w:hyperlink>
+      <w:r>
+        <w:t xml:space="preserve">.</w:t>
+      </w:r>
+    </w:p>
+    <w:bookmarkEnd w:id="62"/>
+    <w:bookmarkEnd w:id="63"/>
+    <w:bookmarkEnd w:id="64"/>
     <w:sectPr>
       <w:footnotePr>
         <w:numRestart w:val="eachSect"/>
@@ -19318,6 +19619,9 @@
     <w:abstractNumId w:val="991"/>
   </w:num>
   <w:num w:numId="1003">
+    <w:abstractNumId w:val="991"/>
+  </w:num>
+  <w:num w:numId="1004">
     <w:abstractNumId w:val="991"/>
   </w:num>
 </w:numbering>

</xml_diff>

<commit_message>
Deploying to gh-pages from @ Morrison-Lab/pds@f2d9e7556284b66bf12ac7f259d5979e6cc36e89 🚀
</commit_message>
<xml_diff>
--- a/independence.docx
+++ b/independence.docx
@@ -15,7 +15,7 @@
         <w:pStyle w:val="Date"/>
       </w:pPr>
       <w:r>
-        <w:t xml:space="preserve">Last modified: 2026-10-18 11:26:57 (PDT)</w:t>
+        <w:t xml:space="preserve">Last modified: 2026-10-18 11:35:41 (PDT)</w:t>
       </w:r>
     </w:p>
     <w:p>
@@ -5421,23 +5421,9 @@
       <w:r>
         <w:t xml:space="preserve"> </w:t>
       </w:r>
-      <m:oMath>
-        <m:limLow>
-          <m:e>
-            <m:r>
-              <m:t>X</m:t>
-            </m:r>
-          </m:e>
-          <m:lim>
-            <m:r>
-              <m:rPr>
-                <m:sty m:val="p"/>
-              </m:rPr>
-              <m:t>∼</m:t>
-            </m:r>
-          </m:lim>
-        </m:limLow>
-      </m:oMath>
+      <w:r>
+        <w:t xml:space="preserve">$\mathord{\smash[b]{\underset{\raise.3ex\hbox{$\scriptstyle\sim$}}{X}}\vphantom{X}}$</w:t>
+      </w:r>
       <w:r>
         <w:t xml:space="preserve"> </w:t>
       </w:r>
@@ -5447,23 +5433,9 @@
       <w:r>
         <w:t xml:space="preserve"> </w:t>
       </w:r>
-      <m:oMath>
-        <m:limLow>
-          <m:e>
-            <m:r>
-              <m:t>x</m:t>
-            </m:r>
-          </m:e>
-          <m:lim>
-            <m:r>
-              <m:rPr>
-                <m:sty m:val="p"/>
-              </m:rPr>
-              <m:t>∼</m:t>
-            </m:r>
-          </m:lim>
-        </m:limLow>
-      </m:oMath>
+      <w:r>
+        <w:t xml:space="preserve">$\mathord{\smash[b]{\underset{\raise.3ex\hbox{$\scriptstyle\sim$}}{x}}\vphantom{x}}$</w:t>
+      </w:r>
       <w:r>
         <w:t xml:space="preserve"> </w:t>
       </w:r>
@@ -5473,71 +5445,9 @@
       <w:r>
         <w:t xml:space="preserve"> </w:t>
       </w:r>
-      <m:oMath>
-        <m:r>
-          <m:rPr>
-            <m:sty m:val="p"/>
-          </m:rPr>
-          <m:t>Pr</m:t>
-        </m:r>
-        <m:r>
-          <m:rPr>
-            <m:sty m:val="p"/>
-          </m:rPr>
-          <m:t>(</m:t>
-        </m:r>
-        <m:limLow>
-          <m:e>
-            <m:r>
-              <m:t>X</m:t>
-            </m:r>
-          </m:e>
-          <m:lim>
-            <m:r>
-              <m:rPr>
-                <m:sty m:val="p"/>
-              </m:rPr>
-              <m:t>∼</m:t>
-            </m:r>
-          </m:lim>
-        </m:limLow>
-        <m:r>
-          <m:rPr>
-            <m:sty m:val="p"/>
-          </m:rPr>
-          <m:t>=</m:t>
-        </m:r>
-        <m:limLow>
-          <m:e>
-            <m:r>
-              <m:t>x</m:t>
-            </m:r>
-          </m:e>
-          <m:lim>
-            <m:r>
-              <m:rPr>
-                <m:sty m:val="p"/>
-              </m:rPr>
-              <m:t>∼</m:t>
-            </m:r>
-          </m:lim>
-        </m:limLow>
-        <m:r>
-          <m:rPr>
-            <m:sty m:val="p"/>
-          </m:rPr>
-          <m:t>)</m:t>
-        </m:r>
-        <m:r>
-          <m:rPr>
-            <m:sty m:val="p"/>
-          </m:rPr>
-          <m:t>&gt;</m:t>
-        </m:r>
-        <m:r>
-          <m:t>0</m:t>
-        </m:r>
-      </m:oMath>
+      <w:r>
+        <w:t xml:space="preserve">$\Pr(\mathord{\smash[b]{\underset{\raise.3ex\hbox{$\scriptstyle\sim$}}{X}}\vphantom{X}}= \mathord{\smash[b]{\underset{\raise.3ex\hbox{$\scriptstyle\sim$}}{x}}\vphantom{x}}) &gt; 0$</w:t>
+      </w:r>
       <w:r>
         <w:t xml:space="preserve"> </w:t>
       </w:r>
@@ -5634,276 +5544,9 @@
       <w:pPr>
         <w:pStyle w:val="BodyText"/>
       </w:pPr>
-      <m:oMathPara>
-        <m:oMathParaPr>
-          <m:jc m:val="center"/>
-        </m:oMathParaPr>
-        <m:oMath>
-          <m:r>
-            <m:rPr>
-              <m:sty m:val="p"/>
-            </m:rPr>
-            <m:t>Pr</m:t>
-          </m:r>
-          <m:r>
-            <m:rPr>
-              <m:sty m:val="p"/>
-            </m:rPr>
-            <m:t>(</m:t>
-          </m:r>
-          <m:sSub>
-            <m:e>
-              <m:r>
-                <m:t>Y</m:t>
-              </m:r>
-            </m:e>
-            <m:sub>
-              <m:r>
-                <m:t>1</m:t>
-              </m:r>
-            </m:sub>
-          </m:sSub>
-          <m:r>
-            <m:rPr>
-              <m:sty m:val="p"/>
-            </m:rPr>
-            <m:t>∈</m:t>
-          </m:r>
-          <m:sSub>
-            <m:e>
-              <m:r>
-                <m:t>A</m:t>
-              </m:r>
-            </m:e>
-            <m:sub>
-              <m:r>
-                <m:t>1</m:t>
-              </m:r>
-            </m:sub>
-          </m:sSub>
-          <m:r>
-            <m:rPr>
-              <m:sty m:val="p"/>
-            </m:rPr>
-            <m:t>,</m:t>
-          </m:r>
-          <m:r>
-            <m:rPr>
-              <m:sty m:val="p"/>
-            </m:rPr>
-            <m:t>…</m:t>
-          </m:r>
-          <m:r>
-            <m:rPr>
-              <m:sty m:val="p"/>
-            </m:rPr>
-            <m:t>,</m:t>
-          </m:r>
-          <m:sSub>
-            <m:e>
-              <m:r>
-                <m:t>Y</m:t>
-              </m:r>
-            </m:e>
-            <m:sub>
-              <m:r>
-                <m:t>n</m:t>
-              </m:r>
-            </m:sub>
-          </m:sSub>
-          <m:r>
-            <m:rPr>
-              <m:sty m:val="p"/>
-            </m:rPr>
-            <m:t>∈</m:t>
-          </m:r>
-          <m:sSub>
-            <m:e>
-              <m:r>
-                <m:t>A</m:t>
-              </m:r>
-            </m:e>
-            <m:sub>
-              <m:r>
-                <m:t>n</m:t>
-              </m:r>
-            </m:sub>
-          </m:sSub>
-          <m:r>
-            <m:rPr>
-              <m:sty m:val="p"/>
-            </m:rPr>
-            <m:t>∣</m:t>
-          </m:r>
-          <m:limLow>
-            <m:e>
-              <m:r>
-                <m:t>X</m:t>
-              </m:r>
-            </m:e>
-            <m:lim>
-              <m:r>
-                <m:rPr>
-                  <m:sty m:val="p"/>
-                </m:rPr>
-                <m:t>∼</m:t>
-              </m:r>
-            </m:lim>
-          </m:limLow>
-          <m:r>
-            <m:rPr>
-              <m:sty m:val="p"/>
-            </m:rPr>
-            <m:t>=</m:t>
-          </m:r>
-          <m:limLow>
-            <m:e>
-              <m:r>
-                <m:t>x</m:t>
-              </m:r>
-            </m:e>
-            <m:lim>
-              <m:r>
-                <m:rPr>
-                  <m:sty m:val="p"/>
-                </m:rPr>
-                <m:t>∼</m:t>
-              </m:r>
-            </m:lim>
-          </m:limLow>
-          <m:r>
-            <m:rPr>
-              <m:sty m:val="p"/>
-            </m:rPr>
-            <m:t>)</m:t>
-          </m:r>
-          <m:r>
-            <m:rPr>
-              <m:sty m:val="p"/>
-            </m:rPr>
-            <m:t>=</m:t>
-          </m:r>
-          <m:nary>
-            <m:naryPr>
-              <m:chr m:val="∏"/>
-              <m:limLoc m:val="undOvr"/>
-              <m:subHide m:val="off"/>
-              <m:supHide m:val="off"/>
-            </m:naryPr>
-            <m:sub>
-              <m:r>
-                <m:t>i</m:t>
-              </m:r>
-              <m:r>
-                <m:rPr>
-                  <m:sty m:val="p"/>
-                </m:rPr>
-                <m:t>=</m:t>
-              </m:r>
-              <m:r>
-                <m:t>1</m:t>
-              </m:r>
-            </m:sub>
-            <m:sup>
-              <m:r>
-                <m:t>n</m:t>
-              </m:r>
-            </m:sup>
-            <m:e>
-              <m:r>
-                <m:rPr>
-                  <m:sty m:val="p"/>
-                </m:rPr>
-                <m:t>Pr</m:t>
-              </m:r>
-              <m:r>
-                <m:rPr>
-                  <m:sty m:val="p"/>
-                </m:rPr>
-                <m:t>(</m:t>
-              </m:r>
-              <m:sSub>
-                <m:e>
-                  <m:r>
-                    <m:t>Y</m:t>
-                  </m:r>
-                </m:e>
-                <m:sub>
-                  <m:r>
-                    <m:t>i</m:t>
-                  </m:r>
-                </m:sub>
-              </m:sSub>
-              <m:r>
-                <m:rPr>
-                  <m:sty m:val="p"/>
-                </m:rPr>
-                <m:t>∈</m:t>
-              </m:r>
-              <m:sSub>
-                <m:e>
-                  <m:r>
-                    <m:t>A</m:t>
-                  </m:r>
-                </m:e>
-                <m:sub>
-                  <m:r>
-                    <m:t>i</m:t>
-                  </m:r>
-                </m:sub>
-              </m:sSub>
-              <m:r>
-                <m:rPr>
-                  <m:sty m:val="p"/>
-                </m:rPr>
-                <m:t>∣</m:t>
-              </m:r>
-              <m:limLow>
-                <m:e>
-                  <m:r>
-                    <m:t>X</m:t>
-                  </m:r>
-                </m:e>
-                <m:lim>
-                  <m:r>
-                    <m:rPr>
-                      <m:sty m:val="p"/>
-                    </m:rPr>
-                    <m:t>∼</m:t>
-                  </m:r>
-                </m:lim>
-              </m:limLow>
-              <m:r>
-                <m:rPr>
-                  <m:sty m:val="p"/>
-                </m:rPr>
-                <m:t>=</m:t>
-              </m:r>
-              <m:limLow>
-                <m:e>
-                  <m:r>
-                    <m:t>x</m:t>
-                  </m:r>
-                </m:e>
-                <m:lim>
-                  <m:r>
-                    <m:rPr>
-                      <m:sty m:val="p"/>
-                    </m:rPr>
-                    <m:t>∼</m:t>
-                  </m:r>
-                </m:lim>
-              </m:limLow>
-              <m:r>
-                <m:rPr>
-                  <m:sty m:val="p"/>
-                </m:rPr>
-                <m:t>)</m:t>
-              </m:r>
-            </m:e>
-          </m:nary>
-        </m:oMath>
-      </m:oMathPara>
+      <w:r>
+        <w:t xml:space="preserve">$$\Pr(Y_1 \in A_1, \ldots, Y_n \in A_n \mid \mathord{\smash[b]{\underset{\raise.3ex\hbox{$\scriptstyle\sim$}}{X}}\vphantom{X}}= \mathord{\smash[b]{\underset{\raise.3ex\hbox{$\scriptstyle\sim$}}{x}}\vphantom{x}}) = \prod_{i=1}^n{\Pr(Y_i \in A_i \mid \mathord{\smash[b]{\underset{\raise.3ex\hbox{$\scriptstyle\sim$}}{X}}\vphantom{X}}= \mathord{\smash[b]{\underset{\raise.3ex\hbox{$\scriptstyle\sim$}}{x}}\vphantom{x}})}$$</w:t>
+      </w:r>
     </w:p>
     <w:p>
       <w:pPr>
@@ -5915,23 +5558,9 @@
       <w:r>
         <w:t xml:space="preserve"> </w:t>
       </w:r>
-      <m:oMath>
-        <m:limLow>
-          <m:e>
-            <m:r>
-              <m:t>X</m:t>
-            </m:r>
-          </m:e>
-          <m:lim>
-            <m:r>
-              <m:rPr>
-                <m:sty m:val="p"/>
-              </m:rPr>
-              <m:t>∼</m:t>
-            </m:r>
-          </m:lim>
-        </m:limLow>
-      </m:oMath>
+      <w:r>
+        <w:t xml:space="preserve">$\mathord{\smash[b]{\underset{\raise.3ex\hbox{$\scriptstyle\sim$}}{X}}\vphantom{X}}$</w:t>
+      </w:r>
       <w:r>
         <w:t xml:space="preserve"> </w:t>
       </w:r>
@@ -5941,56 +5570,9 @@
       <w:r>
         <w:t xml:space="preserve"> </w:t>
       </w:r>
-      <m:oMath>
-        <m:r>
-          <m:rPr>
-            <m:sty m:val="p"/>
-          </m:rPr>
-          <m:t>{</m:t>
-        </m:r>
-        <m:limLow>
-          <m:e>
-            <m:r>
-              <m:t>X</m:t>
-            </m:r>
-          </m:e>
-          <m:lim>
-            <m:r>
-              <m:rPr>
-                <m:sty m:val="p"/>
-              </m:rPr>
-              <m:t>∼</m:t>
-            </m:r>
-          </m:lim>
-        </m:limLow>
-        <m:r>
-          <m:rPr>
-            <m:sty m:val="p"/>
-          </m:rPr>
-          <m:t>=</m:t>
-        </m:r>
-        <m:limLow>
-          <m:e>
-            <m:r>
-              <m:t>x</m:t>
-            </m:r>
-          </m:e>
-          <m:lim>
-            <m:r>
-              <m:rPr>
-                <m:sty m:val="p"/>
-              </m:rPr>
-              <m:t>∼</m:t>
-            </m:r>
-          </m:lim>
-        </m:limLow>
-        <m:r>
-          <m:rPr>
-            <m:sty m:val="p"/>
-          </m:rPr>
-          <m:t>}</m:t>
-        </m:r>
-      </m:oMath>
+      <w:r>
+        <w:t xml:space="preserve">$\{\mathord{\smash[b]{\underset{\raise.3ex\hbox{$\scriptstyle\sim$}}{X}}\vphantom{X}}= \mathord{\smash[b]{\underset{\raise.3ex\hbox{$\scriptstyle\sim$}}{x}}\vphantom{x}}\}$</w:t>
+      </w:r>
       <w:r>
         <w:t xml:space="preserve"> </w:t>
       </w:r>
@@ -6012,23 +5594,9 @@
       <w:r>
         <w:t xml:space="preserve"> </w:t>
       </w:r>
-      <m:oMath>
-        <m:limLow>
-          <m:e>
-            <m:r>
-              <m:t>x</m:t>
-            </m:r>
-          </m:e>
-          <m:lim>
-            <m:r>
-              <m:rPr>
-                <m:sty m:val="p"/>
-              </m:rPr>
-              <m:t>∼</m:t>
-            </m:r>
-          </m:lim>
-        </m:limLow>
-      </m:oMath>
+      <w:r>
+        <w:t xml:space="preserve">$\mathord{\smash[b]{\underset{\raise.3ex\hbox{$\scriptstyle\sim$}}{x}}\vphantom{x}}$</w:t>
+      </w:r>
       <w:r>
         <w:t xml:space="preserve"> </w:t>
       </w:r>
@@ -6038,71 +5606,9 @@
       <w:r>
         <w:t xml:space="preserve"> </w:t>
       </w:r>
-      <m:oMath>
-        <m:r>
-          <m:rPr>
-            <m:sty m:val="p"/>
-          </m:rPr>
-          <m:t>p</m:t>
-        </m:r>
-        <m:r>
-          <m:rPr>
-            <m:sty m:val="p"/>
-          </m:rPr>
-          <m:t>(</m:t>
-        </m:r>
-        <m:limLow>
-          <m:e>
-            <m:r>
-              <m:t>X</m:t>
-            </m:r>
-          </m:e>
-          <m:lim>
-            <m:r>
-              <m:rPr>
-                <m:sty m:val="p"/>
-              </m:rPr>
-              <m:t>∼</m:t>
-            </m:r>
-          </m:lim>
-        </m:limLow>
-        <m:r>
-          <m:rPr>
-            <m:sty m:val="p"/>
-          </m:rPr>
-          <m:t>=</m:t>
-        </m:r>
-        <m:limLow>
-          <m:e>
-            <m:r>
-              <m:t>x</m:t>
-            </m:r>
-          </m:e>
-          <m:lim>
-            <m:r>
-              <m:rPr>
-                <m:sty m:val="p"/>
-              </m:rPr>
-              <m:t>∼</m:t>
-            </m:r>
-          </m:lim>
-        </m:limLow>
-        <m:r>
-          <m:rPr>
-            <m:sty m:val="p"/>
-          </m:rPr>
-          <m:t>)</m:t>
-        </m:r>
-        <m:r>
-          <m:rPr>
-            <m:sty m:val="p"/>
-          </m:rPr>
-          <m:t>&gt;</m:t>
-        </m:r>
-        <m:r>
-          <m:t>0</m:t>
-        </m:r>
-      </m:oMath>
+      <w:r>
+        <w:t xml:space="preserve">$\operatorname{p}(\mathord{\smash[b]{\underset{\raise.3ex\hbox{$\scriptstyle\sim$}}{X}}\vphantom{X}}= \mathord{\smash[b]{\underset{\raise.3ex\hbox{$\scriptstyle\sim$}}{x}}\vphantom{x}}) &gt; 0$</w:t>
+      </w:r>
       <w:r>
         <w:t xml:space="preserve"> </w:t>
       </w:r>
@@ -6164,402 +5670,9 @@
       <w:pPr>
         <w:pStyle w:val="BodyText"/>
       </w:pPr>
-      <m:oMathPara>
-        <m:oMathParaPr>
-          <m:jc m:val="center"/>
-        </m:oMathParaPr>
-        <m:oMath>
-          <m:f>
-            <m:fPr>
-              <m:type m:val="bar"/>
-            </m:fPr>
-            <m:num>
-              <m:r>
-                <m:rPr>
-                  <m:sty m:val="p"/>
-                </m:rPr>
-                <m:t>p</m:t>
-              </m:r>
-              <m:r>
-                <m:rPr>
-                  <m:sty m:val="p"/>
-                </m:rPr>
-                <m:t>(</m:t>
-              </m:r>
-              <m:limLow>
-                <m:e>
-                  <m:r>
-                    <m:t>X</m:t>
-                  </m:r>
-                </m:e>
-                <m:lim>
-                  <m:r>
-                    <m:rPr>
-                      <m:sty m:val="p"/>
-                    </m:rPr>
-                    <m:t>∼</m:t>
-                  </m:r>
-                </m:lim>
-              </m:limLow>
-              <m:r>
-                <m:rPr>
-                  <m:sty m:val="p"/>
-                </m:rPr>
-                <m:t>=</m:t>
-              </m:r>
-              <m:limLow>
-                <m:e>
-                  <m:r>
-                    <m:t>x</m:t>
-                  </m:r>
-                </m:e>
-                <m:lim>
-                  <m:r>
-                    <m:rPr>
-                      <m:sty m:val="p"/>
-                    </m:rPr>
-                    <m:t>∼</m:t>
-                  </m:r>
-                </m:lim>
-              </m:limLow>
-              <m:r>
-                <m:rPr>
-                  <m:sty m:val="p"/>
-                </m:rPr>
-                <m:t>,</m:t>
-              </m:r>
-              <m:sSub>
-                <m:e>
-                  <m:r>
-                    <m:t>Y</m:t>
-                  </m:r>
-                </m:e>
-                <m:sub>
-                  <m:r>
-                    <m:t>1</m:t>
-                  </m:r>
-                </m:sub>
-              </m:sSub>
-              <m:r>
-                <m:rPr>
-                  <m:sty m:val="p"/>
-                </m:rPr>
-                <m:t>=</m:t>
-              </m:r>
-              <m:sSub>
-                <m:e>
-                  <m:r>
-                    <m:t>y</m:t>
-                  </m:r>
-                </m:e>
-                <m:sub>
-                  <m:r>
-                    <m:t>1</m:t>
-                  </m:r>
-                </m:sub>
-              </m:sSub>
-              <m:r>
-                <m:rPr>
-                  <m:sty m:val="p"/>
-                </m:rPr>
-                <m:t>,</m:t>
-              </m:r>
-              <m:r>
-                <m:rPr>
-                  <m:sty m:val="p"/>
-                </m:rPr>
-                <m:t>…</m:t>
-              </m:r>
-              <m:r>
-                <m:rPr>
-                  <m:sty m:val="p"/>
-                </m:rPr>
-                <m:t>,</m:t>
-              </m:r>
-              <m:sSub>
-                <m:e>
-                  <m:r>
-                    <m:t>Y</m:t>
-                  </m:r>
-                </m:e>
-                <m:sub>
-                  <m:r>
-                    <m:t>n</m:t>
-                  </m:r>
-                </m:sub>
-              </m:sSub>
-              <m:r>
-                <m:rPr>
-                  <m:sty m:val="p"/>
-                </m:rPr>
-                <m:t>=</m:t>
-              </m:r>
-              <m:sSub>
-                <m:e>
-                  <m:r>
-                    <m:t>y</m:t>
-                  </m:r>
-                </m:e>
-                <m:sub>
-                  <m:r>
-                    <m:t>n</m:t>
-                  </m:r>
-                </m:sub>
-              </m:sSub>
-              <m:r>
-                <m:rPr>
-                  <m:sty m:val="p"/>
-                </m:rPr>
-                <m:t>)</m:t>
-              </m:r>
-            </m:num>
-            <m:den>
-              <m:r>
-                <m:rPr>
-                  <m:sty m:val="p"/>
-                </m:rPr>
-                <m:t>p</m:t>
-              </m:r>
-              <m:r>
-                <m:rPr>
-                  <m:sty m:val="p"/>
-                </m:rPr>
-                <m:t>(</m:t>
-              </m:r>
-              <m:limLow>
-                <m:e>
-                  <m:r>
-                    <m:t>X</m:t>
-                  </m:r>
-                </m:e>
-                <m:lim>
-                  <m:r>
-                    <m:rPr>
-                      <m:sty m:val="p"/>
-                    </m:rPr>
-                    <m:t>∼</m:t>
-                  </m:r>
-                </m:lim>
-              </m:limLow>
-              <m:r>
-                <m:rPr>
-                  <m:sty m:val="p"/>
-                </m:rPr>
-                <m:t>=</m:t>
-              </m:r>
-              <m:limLow>
-                <m:e>
-                  <m:r>
-                    <m:t>x</m:t>
-                  </m:r>
-                </m:e>
-                <m:lim>
-                  <m:r>
-                    <m:rPr>
-                      <m:sty m:val="p"/>
-                    </m:rPr>
-                    <m:t>∼</m:t>
-                  </m:r>
-                </m:lim>
-              </m:limLow>
-              <m:r>
-                <m:rPr>
-                  <m:sty m:val="p"/>
-                </m:rPr>
-                <m:t>)</m:t>
-              </m:r>
-            </m:den>
-          </m:f>
-          <m:r>
-            <m:rPr>
-              <m:sty m:val="p"/>
-            </m:rPr>
-            <m:t>=</m:t>
-          </m:r>
-          <m:nary>
-            <m:naryPr>
-              <m:chr m:val="∏"/>
-              <m:limLoc m:val="undOvr"/>
-              <m:subHide m:val="off"/>
-              <m:supHide m:val="off"/>
-            </m:naryPr>
-            <m:sub>
-              <m:r>
-                <m:t>i</m:t>
-              </m:r>
-              <m:r>
-                <m:rPr>
-                  <m:sty m:val="p"/>
-                </m:rPr>
-                <m:t>=</m:t>
-              </m:r>
-              <m:r>
-                <m:t>1</m:t>
-              </m:r>
-            </m:sub>
-            <m:sup>
-              <m:r>
-                <m:t>n</m:t>
-              </m:r>
-            </m:sup>
-            <m:e>
-              <m:f>
-                <m:fPr>
-                  <m:type m:val="bar"/>
-                </m:fPr>
-                <m:num>
-                  <m:r>
-                    <m:rPr>
-                      <m:sty m:val="p"/>
-                    </m:rPr>
-                    <m:t>p</m:t>
-                  </m:r>
-                  <m:r>
-                    <m:rPr>
-                      <m:sty m:val="p"/>
-                    </m:rPr>
-                    <m:t>(</m:t>
-                  </m:r>
-                  <m:limLow>
-                    <m:e>
-                      <m:r>
-                        <m:t>X</m:t>
-                      </m:r>
-                    </m:e>
-                    <m:lim>
-                      <m:r>
-                        <m:rPr>
-                          <m:sty m:val="p"/>
-                        </m:rPr>
-                        <m:t>∼</m:t>
-                      </m:r>
-                    </m:lim>
-                  </m:limLow>
-                  <m:r>
-                    <m:rPr>
-                      <m:sty m:val="p"/>
-                    </m:rPr>
-                    <m:t>=</m:t>
-                  </m:r>
-                  <m:limLow>
-                    <m:e>
-                      <m:r>
-                        <m:t>x</m:t>
-                      </m:r>
-                    </m:e>
-                    <m:lim>
-                      <m:r>
-                        <m:rPr>
-                          <m:sty m:val="p"/>
-                        </m:rPr>
-                        <m:t>∼</m:t>
-                      </m:r>
-                    </m:lim>
-                  </m:limLow>
-                  <m:r>
-                    <m:rPr>
-                      <m:sty m:val="p"/>
-                    </m:rPr>
-                    <m:t>,</m:t>
-                  </m:r>
-                  <m:sSub>
-                    <m:e>
-                      <m:r>
-                        <m:t>Y</m:t>
-                      </m:r>
-                    </m:e>
-                    <m:sub>
-                      <m:r>
-                        <m:t>i</m:t>
-                      </m:r>
-                    </m:sub>
-                  </m:sSub>
-                  <m:r>
-                    <m:rPr>
-                      <m:sty m:val="p"/>
-                    </m:rPr>
-                    <m:t>=</m:t>
-                  </m:r>
-                  <m:sSub>
-                    <m:e>
-                      <m:r>
-                        <m:t>y</m:t>
-                      </m:r>
-                    </m:e>
-                    <m:sub>
-                      <m:r>
-                        <m:t>i</m:t>
-                      </m:r>
-                    </m:sub>
-                  </m:sSub>
-                  <m:r>
-                    <m:rPr>
-                      <m:sty m:val="p"/>
-                    </m:rPr>
-                    <m:t>)</m:t>
-                  </m:r>
-                </m:num>
-                <m:den>
-                  <m:r>
-                    <m:rPr>
-                      <m:sty m:val="p"/>
-                    </m:rPr>
-                    <m:t>p</m:t>
-                  </m:r>
-                  <m:r>
-                    <m:rPr>
-                      <m:sty m:val="p"/>
-                    </m:rPr>
-                    <m:t>(</m:t>
-                  </m:r>
-                  <m:limLow>
-                    <m:e>
-                      <m:r>
-                        <m:t>X</m:t>
-                      </m:r>
-                    </m:e>
-                    <m:lim>
-                      <m:r>
-                        <m:rPr>
-                          <m:sty m:val="p"/>
-                        </m:rPr>
-                        <m:t>∼</m:t>
-                      </m:r>
-                    </m:lim>
-                  </m:limLow>
-                  <m:r>
-                    <m:rPr>
-                      <m:sty m:val="p"/>
-                    </m:rPr>
-                    <m:t>=</m:t>
-                  </m:r>
-                  <m:limLow>
-                    <m:e>
-                      <m:r>
-                        <m:t>x</m:t>
-                      </m:r>
-                    </m:e>
-                    <m:lim>
-                      <m:r>
-                        <m:rPr>
-                          <m:sty m:val="p"/>
-                        </m:rPr>
-                        <m:t>∼</m:t>
-                      </m:r>
-                    </m:lim>
-                  </m:limLow>
-                  <m:r>
-                    <m:rPr>
-                      <m:sty m:val="p"/>
-                    </m:rPr>
-                    <m:t>)</m:t>
-                  </m:r>
-                </m:den>
-              </m:f>
-            </m:e>
-          </m:nary>
-        </m:oMath>
-      </m:oMathPara>
+      <w:r>
+        <w:t xml:space="preserve">$$\frac{\operatorname{p}(\mathord{\smash[b]{\underset{\raise.3ex\hbox{$\scriptstyle\sim$}}{X}}\vphantom{X}}= \mathord{\smash[b]{\underset{\raise.3ex\hbox{$\scriptstyle\sim$}}{x}}\vphantom{x}}, Y_1 = y_1, \ldots, Y_n = y_n)}{\operatorname{p}(\mathord{\smash[b]{\underset{\raise.3ex\hbox{$\scriptstyle\sim$}}{X}}\vphantom{X}}= \mathord{\smash[b]{\underset{\raise.3ex\hbox{$\scriptstyle\sim$}}{x}}\vphantom{x}})} = \prod_{i=1}^n{\frac{\operatorname{p}(\mathord{\smash[b]{\underset{\raise.3ex\hbox{$\scriptstyle\sim$}}{X}}\vphantom{X}}= \mathord{\smash[b]{\underset{\raise.3ex\hbox{$\scriptstyle\sim$}}{x}}\vphantom{x}}, Y_i = y_i)}{\operatorname{p}(\mathord{\smash[b]{\underset{\raise.3ex\hbox{$\scriptstyle\sim$}}{X}}\vphantom{X}}= \mathord{\smash[b]{\underset{\raise.3ex\hbox{$\scriptstyle\sim$}}{x}}\vphantom{x}})}}$$</w:t>
+      </w:r>
     </w:p>
     <w:p>
       <w:pPr>
@@ -6682,23 +5795,9 @@
       <w:r>
         <w:t xml:space="preserve"> </w:t>
       </w:r>
-      <m:oMath>
-        <m:limLow>
-          <m:e>
-            <m:r>
-              <m:t>X</m:t>
-            </m:r>
-          </m:e>
-          <m:lim>
-            <m:r>
-              <m:rPr>
-                <m:sty m:val="p"/>
-              </m:rPr>
-              <m:t>∼</m:t>
-            </m:r>
-          </m:lim>
-        </m:limLow>
-      </m:oMath>
+      <w:r>
+        <w:t xml:space="preserve">$\mathord{\smash[b]{\underset{\raise.3ex\hbox{$\scriptstyle\sim$}}{X}}\vphantom{X}}$</w:t>
+      </w:r>
       <w:r>
         <w:t xml:space="preserve">,</w:t>
       </w:r>
@@ -6728,44 +5827,9 @@
       <w:r>
         <w:t xml:space="preserve"> </w:t>
       </w:r>
-      <m:oMath>
-        <m:limLow>
-          <m:e>
-            <m:r>
-              <m:t>X</m:t>
-            </m:r>
-          </m:e>
-          <m:lim>
-            <m:r>
-              <m:rPr>
-                <m:sty m:val="p"/>
-              </m:rPr>
-              <m:t>∼</m:t>
-            </m:r>
-          </m:lim>
-        </m:limLow>
-        <m:r>
-          <m:rPr>
-            <m:sty m:val="p"/>
-          </m:rPr>
-          <m:t>=</m:t>
-        </m:r>
-        <m:limLow>
-          <m:e>
-            <m:r>
-              <m:t>x</m:t>
-            </m:r>
-          </m:e>
-          <m:lim>
-            <m:r>
-              <m:rPr>
-                <m:sty m:val="p"/>
-              </m:rPr>
-              <m:t>∼</m:t>
-            </m:r>
-          </m:lim>
-        </m:limLow>
-      </m:oMath>
+      <w:r>
+        <w:t xml:space="preserve">$\mathord{\smash[b]{\underset{\raise.3ex\hbox{$\scriptstyle\sim$}}{X}}\vphantom{X}}= \mathord{\smash[b]{\underset{\raise.3ex\hbox{$\scriptstyle\sim$}}{x}}\vphantom{x}}$</w:t>
+      </w:r>
       <w:r>
         <w:t xml:space="preserve">,</w:t>
       </w:r>
@@ -6784,44 +5848,9 @@
       <w:r>
         <w:t xml:space="preserve"> </w:t>
       </w:r>
-      <m:oMath>
-        <m:limLow>
-          <m:e>
-            <m:r>
-              <m:t>X</m:t>
-            </m:r>
-          </m:e>
-          <m:lim>
-            <m:r>
-              <m:rPr>
-                <m:sty m:val="p"/>
-              </m:rPr>
-              <m:t>∼</m:t>
-            </m:r>
-          </m:lim>
-        </m:limLow>
-        <m:r>
-          <m:rPr>
-            <m:sty m:val="p"/>
-          </m:rPr>
-          <m:t>=</m:t>
-        </m:r>
-        <m:limLow>
-          <m:e>
-            <m:r>
-              <m:t>x</m:t>
-            </m:r>
-          </m:e>
-          <m:lim>
-            <m:r>
-              <m:rPr>
-                <m:sty m:val="p"/>
-              </m:rPr>
-              <m:t>∼</m:t>
-            </m:r>
-          </m:lim>
-        </m:limLow>
-      </m:oMath>
+      <w:r>
+        <w:t xml:space="preserve">$\mathord{\smash[b]{\underset{\raise.3ex\hbox{$\scriptstyle\sim$}}{X}}\vphantom{X}}= \mathord{\smash[b]{\underset{\raise.3ex\hbox{$\scriptstyle\sim$}}{x}}\vphantom{x}}$</w:t>
+      </w:r>
       <w:r>
         <w:t xml:space="preserve">, the</w:t>
       </w:r>
@@ -9755,83 +8784,9 @@
       <w:r>
         <w:t xml:space="preserve"> </w:t>
       </w:r>
-      <m:oMath>
-        <m:limLow>
-          <m:e>
-            <m:r>
-              <m:t>X</m:t>
-            </m:r>
-          </m:e>
-          <m:lim>
-            <m:r>
-              <m:rPr>
-                <m:sty m:val="p"/>
-              </m:rPr>
-              <m:t>∼</m:t>
-            </m:r>
-          </m:lim>
-        </m:limLow>
-        <m:r>
-          <m:rPr>
-            <m:sty m:val="p"/>
-          </m:rPr>
-          <m:t>=</m:t>
-        </m:r>
-        <m:r>
-          <m:rPr>
-            <m:sty m:val="p"/>
-          </m:rPr>
-          <m:t>(</m:t>
-        </m:r>
-        <m:sSub>
-          <m:e>
-            <m:r>
-              <m:t>X</m:t>
-            </m:r>
-          </m:e>
-          <m:sub>
-            <m:r>
-              <m:t>1</m:t>
-            </m:r>
-          </m:sub>
-        </m:sSub>
-        <m:r>
-          <m:rPr>
-            <m:sty m:val="p"/>
-          </m:rPr>
-          <m:t>,</m:t>
-        </m:r>
-        <m:r>
-          <m:rPr>
-            <m:sty m:val="p"/>
-          </m:rPr>
-          <m:t>…</m:t>
-        </m:r>
-        <m:r>
-          <m:rPr>
-            <m:sty m:val="p"/>
-          </m:rPr>
-          <m:t>,</m:t>
-        </m:r>
-        <m:sSub>
-          <m:e>
-            <m:r>
-              <m:t>X</m:t>
-            </m:r>
-          </m:e>
-          <m:sub>
-            <m:r>
-              <m:t>n</m:t>
-            </m:r>
-          </m:sub>
-        </m:sSub>
-        <m:r>
-          <m:rPr>
-            <m:sty m:val="p"/>
-          </m:rPr>
-          <m:t>)</m:t>
-        </m:r>
-      </m:oMath>
+      <w:r>
+        <w:t xml:space="preserve">$\mathord{\smash[b]{\underset{\raise.3ex\hbox{$\scriptstyle\sim$}}{X}}\vphantom{X}}= (X_1, \ldots, X_n)$</w:t>
+      </w:r>
       <w:r>
         <w:t xml:space="preserve"> </w:t>
       </w:r>
@@ -9917,23 +8872,9 @@
       <w:r>
         <w:t xml:space="preserve"> </w:t>
       </w:r>
-      <m:oMath>
-        <m:limLow>
-          <m:e>
-            <m:r>
-              <m:t>X</m:t>
-            </m:r>
-          </m:e>
-          <m:lim>
-            <m:r>
-              <m:rPr>
-                <m:sty m:val="p"/>
-              </m:rPr>
-              <m:t>∼</m:t>
-            </m:r>
-          </m:lim>
-        </m:limLow>
-      </m:oMath>
+      <w:r>
+        <w:t xml:space="preserve">$\mathord{\smash[b]{\underset{\raise.3ex\hbox{$\scriptstyle\sim$}}{X}}\vphantom{X}}$</w:t>
+      </w:r>
       <w:r>
         <w:t xml:space="preserve">.</w:t>
       </w:r>
@@ -9969,23 +8910,9 @@
       <w:r>
         <w:t xml:space="preserve"> </w:t>
       </w:r>
-      <m:oMath>
-        <m:limLow>
-          <m:e>
-            <m:r>
-              <m:t>X</m:t>
-            </m:r>
-          </m:e>
-          <m:lim>
-            <m:r>
-              <m:rPr>
-                <m:sty m:val="p"/>
-              </m:rPr>
-              <m:t>∼</m:t>
-            </m:r>
-          </m:lim>
-        </m:limLow>
-      </m:oMath>
+      <w:r>
+        <w:t xml:space="preserve">$\mathord{\smash[b]{\underset{\raise.3ex\hbox{$\scriptstyle\sim$}}{X}}\vphantom{X}}$</w:t>
+      </w:r>
       <w:r>
         <w:t xml:space="preserve"> </w:t>
       </w:r>
@@ -10021,83 +8948,9 @@
       <w:r>
         <w:t xml:space="preserve"> </w:t>
       </w:r>
-      <m:oMath>
-        <m:limLow>
-          <m:e>
-            <m:r>
-              <m:t>x</m:t>
-            </m:r>
-          </m:e>
-          <m:lim>
-            <m:r>
-              <m:rPr>
-                <m:sty m:val="p"/>
-              </m:rPr>
-              <m:t>∼</m:t>
-            </m:r>
-          </m:lim>
-        </m:limLow>
-        <m:r>
-          <m:rPr>
-            <m:sty m:val="p"/>
-          </m:rPr>
-          <m:t>=</m:t>
-        </m:r>
-        <m:r>
-          <m:rPr>
-            <m:sty m:val="p"/>
-          </m:rPr>
-          <m:t>(</m:t>
-        </m:r>
-        <m:sSub>
-          <m:e>
-            <m:r>
-              <m:t>x</m:t>
-            </m:r>
-          </m:e>
-          <m:sub>
-            <m:r>
-              <m:t>1</m:t>
-            </m:r>
-          </m:sub>
-        </m:sSub>
-        <m:r>
-          <m:rPr>
-            <m:sty m:val="p"/>
-          </m:rPr>
-          <m:t>,</m:t>
-        </m:r>
-        <m:r>
-          <m:rPr>
-            <m:sty m:val="p"/>
-          </m:rPr>
-          <m:t>…</m:t>
-        </m:r>
-        <m:r>
-          <m:rPr>
-            <m:sty m:val="p"/>
-          </m:rPr>
-          <m:t>,</m:t>
-        </m:r>
-        <m:sSub>
-          <m:e>
-            <m:r>
-              <m:t>x</m:t>
-            </m:r>
-          </m:e>
-          <m:sub>
-            <m:r>
-              <m:t>n</m:t>
-            </m:r>
-          </m:sub>
-        </m:sSub>
-        <m:r>
-          <m:rPr>
-            <m:sty m:val="p"/>
-          </m:rPr>
-          <m:t>)</m:t>
-        </m:r>
-      </m:oMath>
+      <w:r>
+        <w:t xml:space="preserve">$\mathord{\smash[b]{\underset{\raise.3ex\hbox{$\scriptstyle\sim$}}{x}}\vphantom{x}}= (x_1, \ldots, x_n)$</w:t>
+      </w:r>
       <w:r>
         <w:t xml:space="preserve"> </w:t>
       </w:r>
@@ -10107,71 +8960,9 @@
       <w:r>
         <w:t xml:space="preserve"> </w:t>
       </w:r>
-      <m:oMath>
-        <m:r>
-          <m:rPr>
-            <m:sty m:val="p"/>
-          </m:rPr>
-          <m:t>Pr</m:t>
-        </m:r>
-        <m:r>
-          <m:rPr>
-            <m:sty m:val="p"/>
-          </m:rPr>
-          <m:t>(</m:t>
-        </m:r>
-        <m:limLow>
-          <m:e>
-            <m:r>
-              <m:t>X</m:t>
-            </m:r>
-          </m:e>
-          <m:lim>
-            <m:r>
-              <m:rPr>
-                <m:sty m:val="p"/>
-              </m:rPr>
-              <m:t>∼</m:t>
-            </m:r>
-          </m:lim>
-        </m:limLow>
-        <m:r>
-          <m:rPr>
-            <m:sty m:val="p"/>
-          </m:rPr>
-          <m:t>=</m:t>
-        </m:r>
-        <m:limLow>
-          <m:e>
-            <m:r>
-              <m:t>x</m:t>
-            </m:r>
-          </m:e>
-          <m:lim>
-            <m:r>
-              <m:rPr>
-                <m:sty m:val="p"/>
-              </m:rPr>
-              <m:t>∼</m:t>
-            </m:r>
-          </m:lim>
-        </m:limLow>
-        <m:r>
-          <m:rPr>
-            <m:sty m:val="p"/>
-          </m:rPr>
-          <m:t>)</m:t>
-        </m:r>
-        <m:r>
-          <m:rPr>
-            <m:sty m:val="p"/>
-          </m:rPr>
-          <m:t>&gt;</m:t>
-        </m:r>
-        <m:r>
-          <m:t>0</m:t>
-        </m:r>
-      </m:oMath>
+      <w:r>
+        <w:t xml:space="preserve">$\Pr(\mathord{\smash[b]{\underset{\raise.3ex\hbox{$\scriptstyle\sim$}}{X}}\vphantom{X}}= \mathord{\smash[b]{\underset{\raise.3ex\hbox{$\scriptstyle\sim$}}{x}}\vphantom{x}}) &gt; 0$</w:t>
+      </w:r>
       <w:r>
         <w:t xml:space="preserve"> </w:t>
       </w:r>
@@ -10203,193 +8994,9 @@
       <w:pPr>
         <w:pStyle w:val="BodyText"/>
       </w:pPr>
-      <m:oMathPara>
-        <m:oMathParaPr>
-          <m:jc m:val="center"/>
-        </m:oMathParaPr>
-        <m:oMath>
-          <m:r>
-            <m:rPr>
-              <m:sty m:val="p"/>
-            </m:rPr>
-            <m:t>Pr</m:t>
-          </m:r>
-          <m:r>
-            <m:rPr>
-              <m:sty m:val="p"/>
-            </m:rPr>
-            <m:t>(</m:t>
-          </m:r>
-          <m:sSub>
-            <m:e>
-              <m:r>
-                <m:t>Y</m:t>
-              </m:r>
-            </m:e>
-            <m:sub>
-              <m:r>
-                <m:t>i</m:t>
-              </m:r>
-            </m:sub>
-          </m:sSub>
-          <m:r>
-            <m:rPr>
-              <m:sty m:val="p"/>
-            </m:rPr>
-            <m:t>∈</m:t>
-          </m:r>
-          <m:sSub>
-            <m:e>
-              <m:r>
-                <m:t>A</m:t>
-              </m:r>
-            </m:e>
-            <m:sub>
-              <m:r>
-                <m:t>i</m:t>
-              </m:r>
-            </m:sub>
-          </m:sSub>
-          <m:r>
-            <m:rPr>
-              <m:sty m:val="p"/>
-            </m:rPr>
-            <m:t>∣</m:t>
-          </m:r>
-          <m:limLow>
-            <m:e>
-              <m:r>
-                <m:t>X</m:t>
-              </m:r>
-            </m:e>
-            <m:lim>
-              <m:r>
-                <m:rPr>
-                  <m:sty m:val="p"/>
-                </m:rPr>
-                <m:t>∼</m:t>
-              </m:r>
-            </m:lim>
-          </m:limLow>
-          <m:r>
-            <m:rPr>
-              <m:sty m:val="p"/>
-            </m:rPr>
-            <m:t>=</m:t>
-          </m:r>
-          <m:limLow>
-            <m:e>
-              <m:r>
-                <m:t>x</m:t>
-              </m:r>
-            </m:e>
-            <m:lim>
-              <m:r>
-                <m:rPr>
-                  <m:sty m:val="p"/>
-                </m:rPr>
-                <m:t>∼</m:t>
-              </m:r>
-            </m:lim>
-          </m:limLow>
-          <m:r>
-            <m:rPr>
-              <m:sty m:val="p"/>
-            </m:rPr>
-            <m:t>)</m:t>
-          </m:r>
-          <m:r>
-            <m:rPr>
-              <m:sty m:val="p"/>
-            </m:rPr>
-            <m:t>=</m:t>
-          </m:r>
-          <m:r>
-            <m:rPr>
-              <m:sty m:val="p"/>
-            </m:rPr>
-            <m:t>Pr</m:t>
-          </m:r>
-          <m:r>
-            <m:rPr>
-              <m:sty m:val="p"/>
-            </m:rPr>
-            <m:t>(</m:t>
-          </m:r>
-          <m:sSub>
-            <m:e>
-              <m:r>
-                <m:t>Y</m:t>
-              </m:r>
-            </m:e>
-            <m:sub>
-              <m:r>
-                <m:t>i</m:t>
-              </m:r>
-            </m:sub>
-          </m:sSub>
-          <m:r>
-            <m:rPr>
-              <m:sty m:val="p"/>
-            </m:rPr>
-            <m:t>∈</m:t>
-          </m:r>
-          <m:sSub>
-            <m:e>
-              <m:r>
-                <m:t>A</m:t>
-              </m:r>
-            </m:e>
-            <m:sub>
-              <m:r>
-                <m:t>i</m:t>
-              </m:r>
-            </m:sub>
-          </m:sSub>
-          <m:r>
-            <m:rPr>
-              <m:sty m:val="p"/>
-            </m:rPr>
-            <m:t>∣</m:t>
-          </m:r>
-          <m:sSub>
-            <m:e>
-              <m:r>
-                <m:t>X</m:t>
-              </m:r>
-            </m:e>
-            <m:sub>
-              <m:r>
-                <m:t>i</m:t>
-              </m:r>
-            </m:sub>
-          </m:sSub>
-          <m:r>
-            <m:rPr>
-              <m:sty m:val="p"/>
-            </m:rPr>
-            <m:t>=</m:t>
-          </m:r>
-          <m:sSub>
-            <m:e>
-              <m:r>
-                <m:t>x</m:t>
-              </m:r>
-            </m:e>
-            <m:sub>
-              <m:r>
-                <m:t>i</m:t>
-              </m:r>
-            </m:sub>
-          </m:sSub>
-          <m:r>
-            <m:rPr>
-              <m:sty m:val="p"/>
-            </m:rPr>
-            <m:t>)</m:t>
-          </m:r>
-        </m:oMath>
-      </m:oMathPara>
+      <w:r>
+        <w:t xml:space="preserve">$$\Pr(Y_i \in A_i \mid \mathord{\smash[b]{\underset{\raise.3ex\hbox{$\scriptstyle\sim$}}{X}}\vphantom{X}}= \mathord{\smash[b]{\underset{\raise.3ex\hbox{$\scriptstyle\sim$}}{x}}\vphantom{x}}) = \Pr(Y_i \in A_i \mid X_i = x_i)$$</w:t>
+      </w:r>
     </w:p>
     <w:p>
       <w:pPr>
@@ -10401,23 +9008,9 @@
       <w:r>
         <w:t xml:space="preserve"> </w:t>
       </w:r>
-      <m:oMath>
-        <m:limLow>
-          <m:e>
-            <m:r>
-              <m:t>x</m:t>
-            </m:r>
-          </m:e>
-          <m:lim>
-            <m:r>
-              <m:rPr>
-                <m:sty m:val="p"/>
-              </m:rPr>
-              <m:t>∼</m:t>
-            </m:r>
-          </m:lim>
-        </m:limLow>
-      </m:oMath>
+      <w:r>
+        <w:t xml:space="preserve">$\mathord{\smash[b]{\underset{\raise.3ex\hbox{$\scriptstyle\sim$}}{x}}\vphantom{x}}$</w:t>
+      </w:r>
       <w:r>
         <w:t xml:space="preserve"> </w:t>
       </w:r>
@@ -10479,270 +9072,9 @@
       <w:pPr>
         <w:pStyle w:val="BodyText"/>
       </w:pPr>
-      <m:oMathPara>
-        <m:oMathParaPr>
-          <m:jc m:val="center"/>
-        </m:oMathParaPr>
-        <m:oMath>
-          <m:r>
-            <m:rPr>
-              <m:sty m:val="p"/>
-            </m:rPr>
-            <m:t>Pr</m:t>
-          </m:r>
-          <m:r>
-            <m:rPr>
-              <m:sty m:val="p"/>
-            </m:rPr>
-            <m:t>(</m:t>
-          </m:r>
-          <m:sSub>
-            <m:e>
-              <m:r>
-                <m:t>Y</m:t>
-              </m:r>
-            </m:e>
-            <m:sub>
-              <m:r>
-                <m:t>1</m:t>
-              </m:r>
-            </m:sub>
-          </m:sSub>
-          <m:r>
-            <m:rPr>
-              <m:sty m:val="p"/>
-            </m:rPr>
-            <m:t>∈</m:t>
-          </m:r>
-          <m:sSub>
-            <m:e>
-              <m:r>
-                <m:t>A</m:t>
-              </m:r>
-            </m:e>
-            <m:sub>
-              <m:r>
-                <m:t>1</m:t>
-              </m:r>
-            </m:sub>
-          </m:sSub>
-          <m:r>
-            <m:rPr>
-              <m:sty m:val="p"/>
-            </m:rPr>
-            <m:t>,</m:t>
-          </m:r>
-          <m:r>
-            <m:rPr>
-              <m:sty m:val="p"/>
-            </m:rPr>
-            <m:t>…</m:t>
-          </m:r>
-          <m:r>
-            <m:rPr>
-              <m:sty m:val="p"/>
-            </m:rPr>
-            <m:t>,</m:t>
-          </m:r>
-          <m:sSub>
-            <m:e>
-              <m:r>
-                <m:t>Y</m:t>
-              </m:r>
-            </m:e>
-            <m:sub>
-              <m:r>
-                <m:t>n</m:t>
-              </m:r>
-            </m:sub>
-          </m:sSub>
-          <m:r>
-            <m:rPr>
-              <m:sty m:val="p"/>
-            </m:rPr>
-            <m:t>∈</m:t>
-          </m:r>
-          <m:sSub>
-            <m:e>
-              <m:r>
-                <m:t>A</m:t>
-              </m:r>
-            </m:e>
-            <m:sub>
-              <m:r>
-                <m:t>n</m:t>
-              </m:r>
-            </m:sub>
-          </m:sSub>
-          <m:r>
-            <m:rPr>
-              <m:sty m:val="p"/>
-            </m:rPr>
-            <m:t>∣</m:t>
-          </m:r>
-          <m:limLow>
-            <m:e>
-              <m:r>
-                <m:t>X</m:t>
-              </m:r>
-            </m:e>
-            <m:lim>
-              <m:r>
-                <m:rPr>
-                  <m:sty m:val="p"/>
-                </m:rPr>
-                <m:t>∼</m:t>
-              </m:r>
-            </m:lim>
-          </m:limLow>
-          <m:r>
-            <m:rPr>
-              <m:sty m:val="p"/>
-            </m:rPr>
-            <m:t>=</m:t>
-          </m:r>
-          <m:limLow>
-            <m:e>
-              <m:r>
-                <m:t>x</m:t>
-              </m:r>
-            </m:e>
-            <m:lim>
-              <m:r>
-                <m:rPr>
-                  <m:sty m:val="p"/>
-                </m:rPr>
-                <m:t>∼</m:t>
-              </m:r>
-            </m:lim>
-          </m:limLow>
-          <m:r>
-            <m:rPr>
-              <m:sty m:val="p"/>
-            </m:rPr>
-            <m:t>)</m:t>
-          </m:r>
-          <m:r>
-            <m:rPr>
-              <m:sty m:val="p"/>
-            </m:rPr>
-            <m:t>=</m:t>
-          </m:r>
-          <m:nary>
-            <m:naryPr>
-              <m:chr m:val="∏"/>
-              <m:limLoc m:val="undOvr"/>
-              <m:subHide m:val="off"/>
-              <m:supHide m:val="off"/>
-            </m:naryPr>
-            <m:sub>
-              <m:r>
-                <m:t>i</m:t>
-              </m:r>
-              <m:r>
-                <m:rPr>
-                  <m:sty m:val="p"/>
-                </m:rPr>
-                <m:t>=</m:t>
-              </m:r>
-              <m:r>
-                <m:t>1</m:t>
-              </m:r>
-            </m:sub>
-            <m:sup>
-              <m:r>
-                <m:t>n</m:t>
-              </m:r>
-            </m:sup>
-            <m:e>
-              <m:r>
-                <m:rPr>
-                  <m:sty m:val="p"/>
-                </m:rPr>
-                <m:t>Pr</m:t>
-              </m:r>
-              <m:r>
-                <m:rPr>
-                  <m:sty m:val="p"/>
-                </m:rPr>
-                <m:t>(</m:t>
-              </m:r>
-              <m:sSub>
-                <m:e>
-                  <m:r>
-                    <m:t>Y</m:t>
-                  </m:r>
-                </m:e>
-                <m:sub>
-                  <m:r>
-                    <m:t>i</m:t>
-                  </m:r>
-                </m:sub>
-              </m:sSub>
-              <m:r>
-                <m:rPr>
-                  <m:sty m:val="p"/>
-                </m:rPr>
-                <m:t>∈</m:t>
-              </m:r>
-              <m:sSub>
-                <m:e>
-                  <m:r>
-                    <m:t>A</m:t>
-                  </m:r>
-                </m:e>
-                <m:sub>
-                  <m:r>
-                    <m:t>i</m:t>
-                  </m:r>
-                </m:sub>
-              </m:sSub>
-              <m:r>
-                <m:rPr>
-                  <m:sty m:val="p"/>
-                </m:rPr>
-                <m:t>∣</m:t>
-              </m:r>
-              <m:sSub>
-                <m:e>
-                  <m:r>
-                    <m:t>X</m:t>
-                  </m:r>
-                </m:e>
-                <m:sub>
-                  <m:r>
-                    <m:t>i</m:t>
-                  </m:r>
-                </m:sub>
-              </m:sSub>
-              <m:r>
-                <m:rPr>
-                  <m:sty m:val="p"/>
-                </m:rPr>
-                <m:t>=</m:t>
-              </m:r>
-              <m:sSub>
-                <m:e>
-                  <m:r>
-                    <m:t>x</m:t>
-                  </m:r>
-                </m:e>
-                <m:sub>
-                  <m:r>
-                    <m:t>i</m:t>
-                  </m:r>
-                </m:sub>
-              </m:sSub>
-              <m:r>
-                <m:rPr>
-                  <m:sty m:val="p"/>
-                </m:rPr>
-                <m:t>)</m:t>
-              </m:r>
-            </m:e>
-          </m:nary>
-        </m:oMath>
-      </m:oMathPara>
+      <w:r>
+        <w:t xml:space="preserve">$$\Pr(Y_1 \in A_1, \ldots, Y_n \in A_n \mid \mathord{\smash[b]{\underset{\raise.3ex\hbox{$\scriptstyle\sim$}}{X}}\vphantom{X}}= \mathord{\smash[b]{\underset{\raise.3ex\hbox{$\scriptstyle\sim$}}{x}}\vphantom{x}}) = \prod_{i=1}^n{\Pr(Y_i \in A_i \mid X_i = x_i)}$$</w:t>
+      </w:r>
     </w:p>
     <w:bookmarkEnd w:id="30"/>
     <w:p>
@@ -10812,125 +9144,9 @@
       <w:r>
         <w:t xml:space="preserve"> </w:t>
       </w:r>
-      <m:oMath>
-        <m:r>
-          <m:rPr>
-            <m:sty m:val="p"/>
-          </m:rPr>
-          <m:t>Pr</m:t>
-        </m:r>
-        <m:r>
-          <m:rPr>
-            <m:sty m:val="p"/>
-          </m:rPr>
-          <m:t>(</m:t>
-        </m:r>
-        <m:sSub>
-          <m:e>
-            <m:r>
-              <m:t>X</m:t>
-            </m:r>
-          </m:e>
-          <m:sub>
-            <m:r>
-              <m:t>i</m:t>
-            </m:r>
-          </m:sub>
-        </m:sSub>
-        <m:r>
-          <m:rPr>
-            <m:sty m:val="p"/>
-          </m:rPr>
-          <m:t>=</m:t>
-        </m:r>
-        <m:sSub>
-          <m:e>
-            <m:r>
-              <m:t>x</m:t>
-            </m:r>
-          </m:e>
-          <m:sub>
-            <m:r>
-              <m:t>i</m:t>
-            </m:r>
-          </m:sub>
-        </m:sSub>
-        <m:r>
-          <m:rPr>
-            <m:sty m:val="p"/>
-          </m:rPr>
-          <m:t>)</m:t>
-        </m:r>
-        <m:r>
-          <m:rPr>
-            <m:sty m:val="p"/>
-          </m:rPr>
-          <m:t>≥</m:t>
-        </m:r>
-        <m:r>
-          <m:rPr>
-            <m:sty m:val="p"/>
-          </m:rPr>
-          <m:t>Pr</m:t>
-        </m:r>
-        <m:r>
-          <m:rPr>
-            <m:sty m:val="p"/>
-          </m:rPr>
-          <m:t>(</m:t>
-        </m:r>
-        <m:limLow>
-          <m:e>
-            <m:r>
-              <m:t>X</m:t>
-            </m:r>
-          </m:e>
-          <m:lim>
-            <m:r>
-              <m:rPr>
-                <m:sty m:val="p"/>
-              </m:rPr>
-              <m:t>∼</m:t>
-            </m:r>
-          </m:lim>
-        </m:limLow>
-        <m:r>
-          <m:rPr>
-            <m:sty m:val="p"/>
-          </m:rPr>
-          <m:t>=</m:t>
-        </m:r>
-        <m:limLow>
-          <m:e>
-            <m:r>
-              <m:t>x</m:t>
-            </m:r>
-          </m:e>
-          <m:lim>
-            <m:r>
-              <m:rPr>
-                <m:sty m:val="p"/>
-              </m:rPr>
-              <m:t>∼</m:t>
-            </m:r>
-          </m:lim>
-        </m:limLow>
-        <m:r>
-          <m:rPr>
-            <m:sty m:val="p"/>
-          </m:rPr>
-          <m:t>)</m:t>
-        </m:r>
-        <m:r>
-          <m:rPr>
-            <m:sty m:val="p"/>
-          </m:rPr>
-          <m:t>&gt;</m:t>
-        </m:r>
-        <m:r>
-          <m:t>0</m:t>
-        </m:r>
-      </m:oMath>
+      <w:r>
+        <w:t xml:space="preserve">$\Pr(X_i = x_i) \ge \Pr(\mathord{\smash[b]{\underset{\raise.3ex\hbox{$\scriptstyle\sim$}}{X}}\vphantom{X}}= \mathord{\smash[b]{\underset{\raise.3ex\hbox{$\scriptstyle\sim$}}{x}}\vphantom{x}}) &gt; 0$</w:t>
+      </w:r>
       <w:r>
         <w:t xml:space="preserve">. So:</w:t>
       </w:r>
@@ -10939,515 +9155,17 @@
       <w:pPr>
         <w:pStyle w:val="BodyText"/>
       </w:pPr>
-      <m:oMathPara>
-        <m:oMathParaPr>
-          <m:jc m:val="center"/>
-        </m:oMathParaPr>
-        <m:oMath>
-          <m:eqArr>
-            <m:e>
-              <m:r>
-                <m:rPr>
-                  <m:sty m:val="p"/>
-                </m:rPr>
-                <m:t>Pr</m:t>
-              </m:r>
-              <m:r>
-                <m:rPr>
-                  <m:sty m:val="p"/>
-                </m:rPr>
-                <m:t>(</m:t>
-              </m:r>
-              <m:sSub>
-                <m:e>
-                  <m:r>
-                    <m:t>Y</m:t>
-                  </m:r>
-                </m:e>
-                <m:sub>
-                  <m:r>
-                    <m:t>1</m:t>
-                  </m:r>
-                </m:sub>
-              </m:sSub>
-              <m:r>
-                <m:rPr>
-                  <m:sty m:val="p"/>
-                </m:rPr>
-                <m:t>∈</m:t>
-              </m:r>
-              <m:sSub>
-                <m:e>
-                  <m:r>
-                    <m:t>A</m:t>
-                  </m:r>
-                </m:e>
-                <m:sub>
-                  <m:r>
-                    <m:t>1</m:t>
-                  </m:r>
-                </m:sub>
-              </m:sSub>
-              <m:r>
-                <m:rPr>
-                  <m:sty m:val="p"/>
-                </m:rPr>
-                <m:t>,</m:t>
-              </m:r>
-              <m:r>
-                <m:rPr>
-                  <m:sty m:val="p"/>
-                </m:rPr>
-                <m:t>…</m:t>
-              </m:r>
-              <m:r>
-                <m:rPr>
-                  <m:sty m:val="p"/>
-                </m:rPr>
-                <m:t>,</m:t>
-              </m:r>
-              <m:sSub>
-                <m:e>
-                  <m:r>
-                    <m:t>Y</m:t>
-                  </m:r>
-                </m:e>
-                <m:sub>
-                  <m:r>
-                    <m:t>n</m:t>
-                  </m:r>
-                </m:sub>
-              </m:sSub>
-              <m:r>
-                <m:rPr>
-                  <m:sty m:val="p"/>
-                </m:rPr>
-                <m:t>∈</m:t>
-              </m:r>
-              <m:sSub>
-                <m:e>
-                  <m:r>
-                    <m:t>A</m:t>
-                  </m:r>
-                </m:e>
-                <m:sub>
-                  <m:r>
-                    <m:t>n</m:t>
-                  </m:r>
-                </m:sub>
-              </m:sSub>
-              <m:r>
-                <m:rPr>
-                  <m:sty m:val="p"/>
-                </m:rPr>
-                <m:t>∣</m:t>
-              </m:r>
-              <m:limLow>
-                <m:e>
-                  <m:r>
-                    <m:t>X</m:t>
-                  </m:r>
-                </m:e>
-                <m:lim>
-                  <m:r>
-                    <m:rPr>
-                      <m:sty m:val="p"/>
-                    </m:rPr>
-                    <m:t>∼</m:t>
-                  </m:r>
-                </m:lim>
-              </m:limLow>
-              <m:r>
-                <m:rPr>
-                  <m:sty m:val="p"/>
-                </m:rPr>
-                <m:t>=</m:t>
-              </m:r>
-              <m:limLow>
-                <m:e>
-                  <m:r>
-                    <m:t>x</m:t>
-                  </m:r>
-                </m:e>
-                <m:lim>
-                  <m:r>
-                    <m:rPr>
-                      <m:sty m:val="p"/>
-                    </m:rPr>
-                    <m:t>∼</m:t>
-                  </m:r>
-                </m:lim>
-              </m:limLow>
-              <m:r>
-                <m:rPr>
-                  <m:sty m:val="p"/>
-                </m:rPr>
-                <m:t>)</m:t>
-              </m:r>
-              <m:r>
-                <m:t>&amp;</m:t>
-              </m:r>
-              <m:r>
-                <m:rPr>
-                  <m:sty m:val="p"/>
-                </m:rPr>
-                <m:t>=</m:t>
-              </m:r>
-              <m:nary>
-                <m:naryPr>
-                  <m:chr m:val="∏"/>
-                  <m:limLoc m:val="undOvr"/>
-                  <m:subHide m:val="off"/>
-                  <m:supHide m:val="off"/>
-                </m:naryPr>
-                <m:sub>
-                  <m:r>
-                    <m:t>i</m:t>
-                  </m:r>
-                  <m:r>
-                    <m:rPr>
-                      <m:sty m:val="p"/>
-                    </m:rPr>
-                    <m:t>=</m:t>
-                  </m:r>
-                  <m:r>
-                    <m:t>1</m:t>
-                  </m:r>
-                </m:sub>
-                <m:sup>
-                  <m:r>
-                    <m:t>n</m:t>
-                  </m:r>
-                </m:sup>
-                <m:e>
-                  <m:r>
-                    <m:rPr>
-                      <m:sty m:val="p"/>
-                    </m:rPr>
-                    <m:t>Pr</m:t>
-                  </m:r>
-                  <m:r>
-                    <m:rPr>
-                      <m:sty m:val="p"/>
-                    </m:rPr>
-                    <m:t>(</m:t>
-                  </m:r>
-                  <m:sSub>
-                    <m:e>
-                      <m:r>
-                        <m:t>Y</m:t>
-                      </m:r>
-                    </m:e>
-                    <m:sub>
-                      <m:r>
-                        <m:t>i</m:t>
-                      </m:r>
-                    </m:sub>
-                  </m:sSub>
-                  <m:r>
-                    <m:rPr>
-                      <m:sty m:val="p"/>
-                    </m:rPr>
-                    <m:t>∈</m:t>
-                  </m:r>
-                  <m:sSub>
-                    <m:e>
-                      <m:r>
-                        <m:t>A</m:t>
-                      </m:r>
-                    </m:e>
-                    <m:sub>
-                      <m:r>
-                        <m:t>i</m:t>
-                      </m:r>
-                    </m:sub>
-                  </m:sSub>
-                  <m:r>
-                    <m:rPr>
-                      <m:sty m:val="p"/>
-                    </m:rPr>
-                    <m:t>∣</m:t>
-                  </m:r>
-                  <m:limLow>
-                    <m:e>
-                      <m:r>
-                        <m:t>X</m:t>
-                      </m:r>
-                    </m:e>
-                    <m:lim>
-                      <m:r>
-                        <m:rPr>
-                          <m:sty m:val="p"/>
-                        </m:rPr>
-                        <m:t>∼</m:t>
-                      </m:r>
-                    </m:lim>
-                  </m:limLow>
-                  <m:r>
-                    <m:rPr>
-                      <m:sty m:val="p"/>
-                    </m:rPr>
-                    <m:t>=</m:t>
-                  </m:r>
-                  <m:limLow>
-                    <m:e>
-                      <m:r>
-                        <m:t>x</m:t>
-                      </m:r>
-                    </m:e>
-                    <m:lim>
-                      <m:r>
-                        <m:rPr>
-                          <m:sty m:val="p"/>
-                        </m:rPr>
-                        <m:t>∼</m:t>
-                      </m:r>
-                    </m:lim>
-                  </m:limLow>
-                  <m:r>
-                    <m:rPr>
-                      <m:sty m:val="p"/>
-                    </m:rPr>
-                    <m:t>)</m:t>
-                  </m:r>
-                </m:e>
-              </m:nary>
-              <m:r>
-                <m:t>&amp;</m:t>
-              </m:r>
-              <m:r>
-                <m:t>&amp;</m:t>
-              </m:r>
-              <m:r>
-                <m:rPr>
-                  <m:nor/>
-                  <m:sty m:val="p"/>
-                </m:rPr>
-                <m:t>(conditional independence given </m:t>
-              </m:r>
-              <m:limLow>
-                <m:e>
-                  <m:r>
-                    <m:t>X</m:t>
-                  </m:r>
-                </m:e>
-                <m:lim>
-                  <m:r>
-                    <m:rPr>
-                      <m:sty m:val="p"/>
-                    </m:rPr>
-                    <m:t>∼</m:t>
-                  </m:r>
-                </m:lim>
-              </m:limLow>
-              <m:r>
-                <m:rPr>
-                  <m:nor/>
-                  <m:sty m:val="p"/>
-                </m:rPr>
-                <m:t>)</m:t>
-              </m:r>
-            </m:e>
-            <m:e>
-              <m:r>
-                <m:t>&amp;</m:t>
-              </m:r>
-              <m:r>
-                <m:rPr>
-                  <m:sty m:val="p"/>
-                </m:rPr>
-                <m:t>=</m:t>
-              </m:r>
-              <m:nary>
-                <m:naryPr>
-                  <m:chr m:val="∏"/>
-                  <m:limLoc m:val="undOvr"/>
-                  <m:subHide m:val="off"/>
-                  <m:supHide m:val="off"/>
-                </m:naryPr>
-                <m:sub>
-                  <m:r>
-                    <m:t>i</m:t>
-                  </m:r>
-                  <m:r>
-                    <m:rPr>
-                      <m:sty m:val="p"/>
-                    </m:rPr>
-                    <m:t>=</m:t>
-                  </m:r>
-                  <m:r>
-                    <m:t>1</m:t>
-                  </m:r>
-                </m:sub>
-                <m:sup>
-                  <m:r>
-                    <m:t>n</m:t>
-                  </m:r>
-                </m:sup>
-                <m:e>
-                  <m:r>
-                    <m:rPr>
-                      <m:sty m:val="p"/>
-                    </m:rPr>
-                    <m:t>Pr</m:t>
-                  </m:r>
-                  <m:r>
-                    <m:rPr>
-                      <m:sty m:val="p"/>
-                    </m:rPr>
-                    <m:t>(</m:t>
-                  </m:r>
-                  <m:sSub>
-                    <m:e>
-                      <m:r>
-                        <m:t>Y</m:t>
-                      </m:r>
-                    </m:e>
-                    <m:sub>
-                      <m:r>
-                        <m:t>i</m:t>
-                      </m:r>
-                    </m:sub>
-                  </m:sSub>
-                  <m:r>
-                    <m:rPr>
-                      <m:sty m:val="p"/>
-                    </m:rPr>
-                    <m:t>∈</m:t>
-                  </m:r>
-                  <m:sSub>
-                    <m:e>
-                      <m:r>
-                        <m:t>A</m:t>
-                      </m:r>
-                    </m:e>
-                    <m:sub>
-                      <m:r>
-                        <m:t>i</m:t>
-                      </m:r>
-                    </m:sub>
-                  </m:sSub>
-                  <m:r>
-                    <m:rPr>
-                      <m:sty m:val="p"/>
-                    </m:rPr>
-                    <m:t>∣</m:t>
-                  </m:r>
-                  <m:sSub>
-                    <m:e>
-                      <m:r>
-                        <m:t>X</m:t>
-                      </m:r>
-                    </m:e>
-                    <m:sub>
-                      <m:r>
-                        <m:t>i</m:t>
-                      </m:r>
-                    </m:sub>
-                  </m:sSub>
-                  <m:r>
-                    <m:rPr>
-                      <m:sty m:val="p"/>
-                    </m:rPr>
-                    <m:t>=</m:t>
-                  </m:r>
-                  <m:sSub>
-                    <m:e>
-                      <m:r>
-                        <m:t>x</m:t>
-                      </m:r>
-                    </m:e>
-                    <m:sub>
-                      <m:r>
-                        <m:t>i</m:t>
-                      </m:r>
-                    </m:sub>
-                  </m:sSub>
-                  <m:r>
-                    <m:rPr>
-                      <m:sty m:val="p"/>
-                    </m:rPr>
-                    <m:t>)</m:t>
-                  </m:r>
-                </m:e>
-              </m:nary>
-              <m:r>
-                <m:t>&amp;</m:t>
-              </m:r>
-              <m:r>
-                <m:t>&amp;</m:t>
-              </m:r>
-              <m:r>
-                <m:rPr>
-                  <m:nor/>
-                  <m:sty m:val="p"/>
-                </m:rPr>
-                <m:t>(each </m:t>
-              </m:r>
-              <m:sSub>
-                <m:e>
-                  <m:r>
-                    <m:t>Y</m:t>
-                  </m:r>
-                </m:e>
-                <m:sub>
-                  <m:r>
-                    <m:t>i</m:t>
-                  </m:r>
-                </m:sub>
-              </m:sSub>
-              <m:r>
-                <m:rPr>
-                  <m:nor/>
-                  <m:sty m:val="p"/>
-                </m:rPr>
-                <m:t> depends on </m:t>
-              </m:r>
-              <m:limLow>
-                <m:e>
-                  <m:r>
-                    <m:t>X</m:t>
-                  </m:r>
-                </m:e>
-                <m:lim>
-                  <m:r>
-                    <m:rPr>
-                      <m:sty m:val="p"/>
-                    </m:rPr>
-                    <m:t>∼</m:t>
-                  </m:r>
-                </m:lim>
-              </m:limLow>
-              <m:r>
-                <m:rPr>
-                  <m:nor/>
-                  <m:sty m:val="p"/>
-                </m:rPr>
-                <m:t> only through </m:t>
-              </m:r>
-              <m:sSub>
-                <m:e>
-                  <m:r>
-                    <m:t>X</m:t>
-                  </m:r>
-                </m:e>
-                <m:sub>
-                  <m:r>
-                    <m:t>i</m:t>
-                  </m:r>
-                </m:sub>
-              </m:sSub>
-              <m:r>
-                <m:rPr>
-                  <m:nor/>
-                  <m:sty m:val="p"/>
-                </m:rPr>
-                <m:t>)</m:t>
-              </m:r>
-            </m:e>
-          </m:eqArr>
-        </m:oMath>
-      </m:oMathPara>
+      <w:r>
+        <w:t xml:space="preserve">$$
+    \begin{aligned}
+    \Pr(Y_1 \in A_1, \ldots, Y_n \in A_n \mid \mathord{\smash[b]{\underset{\raise.3ex\hbox{$\scriptstyle\sim$}}{X}}\vphantom{X}}= \mathord{\smash[b]{\underset{\raise.3ex\hbox{$\scriptstyle\sim$}}{x}}\vphantom{x}})
+    &amp;= \prod_{i=1}^n{\Pr(Y_i \in A_i \mid \mathord{\smash[b]{\underset{\raise.3ex\hbox{$\scriptstyle\sim$}}{X}}\vphantom{X}}= \mathord{\smash[b]{\underset{\raise.3ex\hbox{$\scriptstyle\sim$}}{x}}\vphantom{x}})}
+    &amp;&amp; \text{(conditional independence given } \mathord{\smash[b]{\underset{\raise.3ex\hbox{$\scriptstyle\sim$}}{X}}\vphantom{X}}\text{)} \\
+    &amp;= \prod_{i=1}^n{\Pr(Y_i \in A_i \mid X_i = x_i)}
+    &amp;&amp; \text{(each } Y_i \text{ depends on } \mathord{\smash[b]{\underset{\raise.3ex\hbox{$\scriptstyle\sim$}}{X}}\vphantom{X}}\text{ only through } X_i \text{)}
+    \end{aligned}
+    $$</w:t>
+      </w:r>
     </w:p>
     <w:p>
       <w:pPr>
@@ -11469,23 +9187,9 @@
       <w:r>
         <w:t xml:space="preserve"> </w:t>
       </w:r>
-      <m:oMath>
-        <m:limLow>
-          <m:e>
-            <m:r>
-              <m:t>X</m:t>
-            </m:r>
-          </m:e>
-          <m:lim>
-            <m:r>
-              <m:rPr>
-                <m:sty m:val="p"/>
-              </m:rPr>
-              <m:t>∼</m:t>
-            </m:r>
-          </m:lim>
-        </m:limLow>
-      </m:oMath>
+      <w:r>
+        <w:t xml:space="preserve">$\mathord{\smash[b]{\underset{\raise.3ex\hbox{$\scriptstyle\sim$}}{X}}\vphantom{X}}$</w:t>
+      </w:r>
       <w:r>
         <w:t xml:space="preserve"> </w:t>
       </w:r>

</xml_diff>